<commit_message>
docs: fix UI comparison report layout (inline bold, table borders/width)
</commit_message>
<xml_diff>
--- a/UI截图对比报告.docx
+++ b/UI截图对比报告.docx
@@ -4,6 +4,7 @@
   <w:body>
     <w:p>
       <w:pPr>
+        <w:spacing w:after="80"/>
         <w:jc w:val="center"/>
       </w:pPr>
       <w:r>
@@ -17,6 +18,7 @@
     </w:p>
     <w:p>
       <w:pPr>
+        <w:spacing w:after="80"/>
         <w:jc w:val="center"/>
       </w:pPr>
       <w:r>
@@ -30,6 +32,7 @@
     </w:p>
     <w:p>
       <w:pPr>
+        <w:spacing w:after="80"/>
         <w:jc w:val="center"/>
       </w:pPr>
       <w:r>
@@ -47,8 +50,14 @@
       </w:pPr>
       <w:r>
         <w:rPr>
+          <w:b/>
+        </w:rPr>
+      </w:r>
+      <w:r>
+        <w:rPr>
           <w:rFonts w:ascii="Arial" w:hAnsi="Arial" w:eastAsia="PingFang SC"/>
           <w:b/>
+          <w:sz w:val="34"/>
         </w:rPr>
         <w:t>1  对比说明</w:t>
       </w:r>
@@ -59,8 +68,14 @@
       </w:pPr>
       <w:r>
         <w:rPr>
+          <w:b/>
+        </w:rPr>
+      </w:r>
+      <w:r>
+        <w:rPr>
           <w:rFonts w:ascii="Arial" w:hAnsi="Arial" w:eastAsia="PingFang SC"/>
           <w:b/>
+          <w:sz w:val="26"/>
         </w:rPr>
         <w:t>1.1  参考素材来源</w:t>
       </w:r>
@@ -68,21 +83,38 @@
     <w:tbl>
       <w:tblPr>
         <w:tblStyle w:val="TableGrid"/>
-        <w:tblW w:type="auto" w:w="0"/>
+        <w:tblW w:type="dxa" w:w="9526"/>
         <w:jc w:val="center"/>
+        <w:tblBorders>
+          <w:top w:val="single" w:sz="4" w:space="0" w:color="808080"/>
+          <w:left w:val="single" w:sz="4" w:space="0" w:color="808080"/>
+          <w:bottom w:val="single" w:sz="4" w:space="0" w:color="808080"/>
+          <w:right w:val="single" w:sz="4" w:space="0" w:color="808080"/>
+          <w:insideH w:val="single" w:sz="4" w:space="0" w:color="808080"/>
+          <w:insideV w:val="single" w:sz="4" w:space="0" w:color="808080"/>
+        </w:tblBorders>
+        <w:tblLayout w:type="fixed"/>
         <w:tblLook w:firstColumn="1" w:firstRow="1" w:lastColumn="0" w:lastRow="0" w:noHBand="0" w:noVBand="1" w:val="04A0"/>
       </w:tblPr>
       <w:tblGrid>
-        <w:gridCol w:w="4706"/>
-        <w:gridCol w:w="4706"/>
+        <w:gridCol w:w="1701"/>
+        <w:gridCol w:w="7824"/>
       </w:tblGrid>
       <w:tr>
+        <w:trPr>
+          <w:tblHeader/>
+        </w:trPr>
         <w:tc>
           <w:tcPr>
             <w:tcW w:type="dxa" w:w="1701"/>
+            <w:shd w:val="clear" w:fill="D9E2F3"/>
           </w:tcPr>
           <w:p>
-            <w:r/>
+            <w:r>
+              <w:rPr>
+                <w:b/>
+              </w:rPr>
+            </w:r>
             <w:r>
               <w:rPr>
                 <w:rFonts w:ascii="Arial" w:hAnsi="Arial" w:eastAsia="PingFang SC"/>
@@ -95,10 +127,15 @@
         </w:tc>
         <w:tc>
           <w:tcPr>
-            <w:tcW w:type="dxa" w:w="7257"/>
+            <w:tcW w:type="dxa" w:w="7824"/>
+            <w:shd w:val="clear" w:fill="D9E2F3"/>
           </w:tcPr>
           <w:p>
-            <w:r/>
+            <w:r>
+              <w:rPr>
+                <w:b/>
+              </w:rPr>
+            </w:r>
             <w:r>
               <w:rPr>
                 <w:rFonts w:ascii="Arial" w:hAnsi="Arial" w:eastAsia="PingFang SC"/>
@@ -129,7 +166,7 @@
         </w:tc>
         <w:tc>
           <w:tcPr>
-            <w:tcW w:type="dxa" w:w="7257"/>
+            <w:tcW w:type="dxa" w:w="7824"/>
           </w:tcPr>
           <w:p>
             <w:r/>
@@ -163,7 +200,7 @@
         </w:tc>
         <w:tc>
           <w:tcPr>
-            <w:tcW w:type="dxa" w:w="7257"/>
+            <w:tcW w:type="dxa" w:w="7824"/>
           </w:tcPr>
           <w:p>
             <w:r/>
@@ -197,7 +234,7 @@
         </w:tc>
         <w:tc>
           <w:tcPr>
-            <w:tcW w:type="dxa" w:w="7257"/>
+            <w:tcW w:type="dxa" w:w="7824"/>
           </w:tcPr>
           <w:p>
             <w:r/>
@@ -231,7 +268,7 @@
         </w:tc>
         <w:tc>
           <w:tcPr>
-            <w:tcW w:type="dxa" w:w="7257"/>
+            <w:tcW w:type="dxa" w:w="7824"/>
           </w:tcPr>
           <w:p>
             <w:r/>
@@ -265,7 +302,7 @@
         </w:tc>
         <w:tc>
           <w:tcPr>
-            <w:tcW w:type="dxa" w:w="7257"/>
+            <w:tcW w:type="dxa" w:w="7824"/>
           </w:tcPr>
           <w:p>
             <w:r/>
@@ -299,7 +336,7 @@
         </w:tc>
         <w:tc>
           <w:tcPr>
-            <w:tcW w:type="dxa" w:w="7257"/>
+            <w:tcW w:type="dxa" w:w="7824"/>
           </w:tcPr>
           <w:p>
             <w:r/>
@@ -326,8 +363,14 @@
       </w:pPr>
       <w:r>
         <w:rPr>
+          <w:b/>
+        </w:rPr>
+      </w:r>
+      <w:r>
+        <w:rPr>
           <w:rFonts w:ascii="Arial" w:hAnsi="Arial" w:eastAsia="PingFang SC"/>
           <w:b/>
+          <w:sz w:val="26"/>
         </w:rPr>
         <w:t>1.2  重要局限（必须说明）</w:t>
       </w:r>
@@ -335,53 +378,89 @@
     <w:p>
       <w:pPr>
         <w:pStyle w:val="ListBullet"/>
-        <w:spacing w:after="20"/>
+        <w:spacing w:after="40"/>
       </w:pPr>
       <w:r>
         <w:rPr>
           <w:rFonts w:ascii="Arial" w:hAnsi="Arial" w:eastAsia="PingFang SC"/>
+          <w:b/>
+          <w:sz w:val="20"/>
+        </w:rPr>
+        <w:t>不是应用内原始截图</w:t>
+      </w:r>
+      <w:r>
+        <w:rPr>
+          <w:rFonts w:ascii="Arial" w:hAnsi="Arial" w:eastAsia="PingFang SC"/>
           <w:b w:val="0"/>
+          <w:sz w:val="20"/>
         </w:rPr>
-        <w:t>**不是应用内原始截图**：商店截图为带设备外框、渐变背景和营销文案的宣传图，不是 App 内直接截屏。</w:t>
+        <w:t>：商店截图为带设备外框、渐变背景和营销文案的宣传图，不是 App 内直接截屏。</w:t>
       </w:r>
     </w:p>
     <w:p>
       <w:pPr>
         <w:pStyle w:val="ListBullet"/>
-        <w:spacing w:after="20"/>
+        <w:spacing w:after="40"/>
       </w:pPr>
       <w:r>
         <w:rPr>
           <w:rFonts w:ascii="Arial" w:hAnsi="Arial" w:eastAsia="PingFang SC"/>
+          <w:b/>
+          <w:sz w:val="20"/>
+        </w:rPr>
+        <w:t>不是教师锁定版本</w:t>
+      </w:r>
+      <w:r>
+        <w:rPr>
+          <w:rFonts w:ascii="Arial" w:hAnsi="Arial" w:eastAsia="PingFang SC"/>
           <w:b w:val="0"/>
+          <w:sz w:val="20"/>
         </w:rPr>
-        <w:t>**不是教师锁定版本**：作业第六节要求教师在项目开始前锁定参考版本；本报告使用的是商店当前在线版 8.65.0，仍需教师确认是否为同一版本。</w:t>
+        <w:t>：作业第六节要求教师在项目开始前锁定参考版本；本报告使用的是商店当前在线版 8.65.0，仍需教师确认是否为同一版本。</w:t>
       </w:r>
     </w:p>
     <w:p>
       <w:pPr>
         <w:pStyle w:val="ListBullet"/>
-        <w:spacing w:after="20"/>
+        <w:spacing w:after="40"/>
       </w:pPr>
       <w:r>
         <w:rPr>
           <w:rFonts w:ascii="Arial" w:hAnsi="Arial" w:eastAsia="PingFang SC"/>
+          <w:b/>
+          <w:sz w:val="20"/>
+        </w:rPr>
+        <w:t>未取得实机截图</w:t>
+      </w:r>
+      <w:r>
+        <w:rPr>
+          <w:rFonts w:ascii="Arial" w:hAnsi="Arial" w:eastAsia="PingFang SC"/>
           <w:b w:val="0"/>
+          <w:sz w:val="20"/>
         </w:rPr>
-        <w:t>**未取得实机截图**：iOS 应用无法通过命令行下载安装（模拟器无 App Store，IPA 受 Apple ID 与 DRM 限制），该 App 也无 macOS 版本，因此无法在本机取得原始界面截图。</w:t>
+        <w:t>：iOS 应用无法通过命令行下载安装（模拟器无 App Store，IPA 受 Apple ID 与 DRM 限制），该 App 也无 macOS 版本，因此无法在本机取得原始界面截图。</w:t>
       </w:r>
     </w:p>
     <w:p>
       <w:pPr>
         <w:pStyle w:val="ListBullet"/>
-        <w:spacing w:after="20"/>
+        <w:spacing w:after="40"/>
       </w:pPr>
       <w:r>
         <w:rPr>
           <w:rFonts w:ascii="Arial" w:hAnsi="Arial" w:eastAsia="PingFang SC"/>
+          <w:b/>
+          <w:sz w:val="20"/>
+        </w:rPr>
+        <w:t>因此本报告定位为「基于公开素材的初步对照」</w:t>
+      </w:r>
+      <w:r>
+        <w:rPr>
+          <w:rFonts w:ascii="Arial" w:hAnsi="Arial" w:eastAsia="PingFang SC"/>
           <w:b w:val="0"/>
+          <w:sz w:val="20"/>
         </w:rPr>
-        <w:t>**因此本报告定位为「基于公开素材的初步对照」**，不能完全替代教师要求版本下的实机截图对比。</w:t>
+        <w:t>，不能完全替代教师要求版本下的实机截图对比。</w:t>
       </w:r>
     </w:p>
     <w:p>
@@ -390,8 +469,14 @@
       </w:pPr>
       <w:r>
         <w:rPr>
+          <w:b/>
+        </w:rPr>
+      </w:r>
+      <w:r>
+        <w:rPr>
           <w:rFonts w:ascii="Arial" w:hAnsi="Arial" w:eastAsia="PingFang SC"/>
           <w:b/>
+          <w:sz w:val="26"/>
         </w:rPr>
         <w:t>1.3  对比范围</w:t>
       </w:r>
@@ -415,8 +500,14 @@
       </w:pPr>
       <w:r>
         <w:rPr>
+          <w:b/>
+        </w:rPr>
+      </w:r>
+      <w:r>
+        <w:rPr>
           <w:rFonts w:ascii="Arial" w:hAnsi="Arial" w:eastAsia="PingFang SC"/>
           <w:b/>
+          <w:sz w:val="34"/>
         </w:rPr>
         <w:t>2  对比维度</w:t>
       </w:r>
@@ -437,21 +528,38 @@
     <w:tbl>
       <w:tblPr>
         <w:tblStyle w:val="TableGrid"/>
-        <w:tblW w:type="auto" w:w="0"/>
+        <w:tblW w:type="dxa" w:w="9526"/>
         <w:jc w:val="center"/>
+        <w:tblBorders>
+          <w:top w:val="single" w:sz="4" w:space="0" w:color="808080"/>
+          <w:left w:val="single" w:sz="4" w:space="0" w:color="808080"/>
+          <w:bottom w:val="single" w:sz="4" w:space="0" w:color="808080"/>
+          <w:right w:val="single" w:sz="4" w:space="0" w:color="808080"/>
+          <w:insideH w:val="single" w:sz="4" w:space="0" w:color="808080"/>
+          <w:insideV w:val="single" w:sz="4" w:space="0" w:color="808080"/>
+        </w:tblBorders>
+        <w:tblLayout w:type="fixed"/>
         <w:tblLook w:firstColumn="1" w:firstRow="1" w:lastColumn="0" w:lastRow="0" w:noHBand="0" w:noVBand="1" w:val="04A0"/>
       </w:tblPr>
       <w:tblGrid>
-        <w:gridCol w:w="4706"/>
-        <w:gridCol w:w="4706"/>
+        <w:gridCol w:w="1814"/>
+        <w:gridCol w:w="7710"/>
       </w:tblGrid>
       <w:tr>
+        <w:trPr>
+          <w:tblHeader/>
+        </w:trPr>
         <w:tc>
           <w:tcPr>
             <w:tcW w:type="dxa" w:w="1814"/>
+            <w:shd w:val="clear" w:fill="D9E2F3"/>
           </w:tcPr>
           <w:p>
-            <w:r/>
+            <w:r>
+              <w:rPr>
+                <w:b/>
+              </w:rPr>
+            </w:r>
             <w:r>
               <w:rPr>
                 <w:rFonts w:ascii="Arial" w:hAnsi="Arial" w:eastAsia="PingFang SC"/>
@@ -464,10 +572,15 @@
         </w:tc>
         <w:tc>
           <w:tcPr>
-            <w:tcW w:type="dxa" w:w="7143"/>
+            <w:tcW w:type="dxa" w:w="7710"/>
+            <w:shd w:val="clear" w:fill="D9E2F3"/>
           </w:tcPr>
           <w:p>
-            <w:r/>
+            <w:r>
+              <w:rPr>
+                <w:b/>
+              </w:rPr>
+            </w:r>
             <w:r>
               <w:rPr>
                 <w:rFonts w:ascii="Arial" w:hAnsi="Arial" w:eastAsia="PingFang SC"/>
@@ -498,7 +611,7 @@
         </w:tc>
         <w:tc>
           <w:tcPr>
-            <w:tcW w:type="dxa" w:w="7143"/>
+            <w:tcW w:type="dxa" w:w="7710"/>
           </w:tcPr>
           <w:p>
             <w:r/>
@@ -532,7 +645,7 @@
         </w:tc>
         <w:tc>
           <w:tcPr>
-            <w:tcW w:type="dxa" w:w="7143"/>
+            <w:tcW w:type="dxa" w:w="7710"/>
           </w:tcPr>
           <w:p>
             <w:r/>
@@ -566,7 +679,7 @@
         </w:tc>
         <w:tc>
           <w:tcPr>
-            <w:tcW w:type="dxa" w:w="7143"/>
+            <w:tcW w:type="dxa" w:w="7710"/>
           </w:tcPr>
           <w:p>
             <w:r/>
@@ -600,7 +713,7 @@
         </w:tc>
         <w:tc>
           <w:tcPr>
-            <w:tcW w:type="dxa" w:w="7143"/>
+            <w:tcW w:type="dxa" w:w="7710"/>
           </w:tcPr>
           <w:p>
             <w:r/>
@@ -634,7 +747,7 @@
         </w:tc>
         <w:tc>
           <w:tcPr>
-            <w:tcW w:type="dxa" w:w="7143"/>
+            <w:tcW w:type="dxa" w:w="7710"/>
           </w:tcPr>
           <w:p>
             <w:r/>
@@ -668,7 +781,7 @@
         </w:tc>
         <w:tc>
           <w:tcPr>
-            <w:tcW w:type="dxa" w:w="7143"/>
+            <w:tcW w:type="dxa" w:w="7710"/>
           </w:tcPr>
           <w:p>
             <w:r/>
@@ -695,8 +808,14 @@
       </w:pPr>
       <w:r>
         <w:rPr>
+          <w:b/>
+        </w:rPr>
+      </w:r>
+      <w:r>
+        <w:rPr>
           <w:rFonts w:ascii="Arial" w:hAnsi="Arial" w:eastAsia="PingFang SC"/>
           <w:b/>
+          <w:sz w:val="34"/>
         </w:rPr>
         <w:t>3  对比一：名片扫描 / 识别</w:t>
       </w:r>
@@ -705,16 +824,17 @@
       <w:tblPr>
         <w:tblW w:type="auto" w:w="0"/>
         <w:jc w:val="center"/>
+        <w:tblLayout w:type="fixed"/>
         <w:tblLook w:firstColumn="1" w:firstRow="1" w:lastColumn="0" w:lastRow="0" w:noHBand="0" w:noVBand="1" w:val="04A0"/>
       </w:tblPr>
       <w:tblGrid>
-        <w:gridCol w:w="4706"/>
-        <w:gridCol w:w="4706"/>
+        <w:gridCol w:w="4819"/>
+        <w:gridCol w:w="4819"/>
       </w:tblGrid>
       <w:tr>
         <w:tc>
           <w:tcPr>
-            <w:tcW w:type="dxa" w:w="4706"/>
+            <w:tcW w:type="dxa" w:w="4819"/>
           </w:tcPr>
           <w:p>
             <w:pPr>
@@ -724,7 +844,7 @@
             <w:r>
               <w:drawing>
                 <wp:inline xmlns:a="http://schemas.openxmlformats.org/drawingml/2006/main" xmlns:pic="http://schemas.openxmlformats.org/drawingml/2006/picture">
-                  <wp:extent cx="1944000" cy="3451592"/>
+                  <wp:extent cx="2015999" cy="3579427"/>
                   <wp:docPr id="1" name="Picture 1"/>
                   <wp:cNvGraphicFramePr>
                     <a:graphicFrameLocks noChangeAspect="1"/>
@@ -745,7 +865,7 @@
                         <pic:spPr>
                           <a:xfrm>
                             <a:off x="0" y="0"/>
-                            <a:ext cx="1944000" cy="3451592"/>
+                            <a:ext cx="2015999" cy="3579427"/>
                           </a:xfrm>
                           <a:prstGeom prst="rect"/>
                         </pic:spPr>
@@ -759,7 +879,7 @@
         </w:tc>
         <w:tc>
           <w:tcPr>
-            <w:tcW w:type="dxa" w:w="4706"/>
+            <w:tcW w:type="dxa" w:w="4819"/>
           </w:tcPr>
           <w:p>
             <w:pPr>
@@ -769,7 +889,7 @@
             <w:r>
               <w:drawing>
                 <wp:inline xmlns:a="http://schemas.openxmlformats.org/drawingml/2006/main" xmlns:pic="http://schemas.openxmlformats.org/drawingml/2006/picture">
-                  <wp:extent cx="1728000" cy="3756895"/>
+                  <wp:extent cx="1764000" cy="3835164"/>
                   <wp:docPr id="2" name="Picture 2"/>
                   <wp:cNvGraphicFramePr>
                     <a:graphicFrameLocks noChangeAspect="1"/>
@@ -790,7 +910,7 @@
                         <pic:spPr>
                           <a:xfrm>
                             <a:off x="0" y="0"/>
-                            <a:ext cx="1728000" cy="3756895"/>
+                            <a:ext cx="1764000" cy="3835164"/>
                           </a:xfrm>
                           <a:prstGeom prst="rect"/>
                         </pic:spPr>
@@ -806,7 +926,7 @@
       <w:tr>
         <w:tc>
           <w:tcPr>
-            <w:tcW w:type="dxa" w:w="4706"/>
+            <w:tcW w:type="dxa" w:w="4819"/>
           </w:tcPr>
           <w:p>
             <w:pPr>
@@ -825,7 +945,7 @@
         </w:tc>
         <w:tc>
           <w:tcPr>
-            <w:tcW w:type="dxa" w:w="4706"/>
+            <w:tcW w:type="dxa" w:w="4819"/>
           </w:tcPr>
           <w:p>
             <w:pPr>
@@ -852,23 +972,40 @@
     <w:tbl>
       <w:tblPr>
         <w:tblStyle w:val="TableGrid"/>
-        <w:tblW w:type="auto" w:w="0"/>
+        <w:tblW w:type="dxa" w:w="9526"/>
         <w:jc w:val="center"/>
+        <w:tblBorders>
+          <w:top w:val="single" w:sz="4" w:space="0" w:color="808080"/>
+          <w:left w:val="single" w:sz="4" w:space="0" w:color="808080"/>
+          <w:bottom w:val="single" w:sz="4" w:space="0" w:color="808080"/>
+          <w:right w:val="single" w:sz="4" w:space="0" w:color="808080"/>
+          <w:insideH w:val="single" w:sz="4" w:space="0" w:color="808080"/>
+          <w:insideV w:val="single" w:sz="4" w:space="0" w:color="808080"/>
+        </w:tblBorders>
+        <w:tblLayout w:type="fixed"/>
         <w:tblLook w:firstColumn="1" w:firstRow="1" w:lastColumn="0" w:lastRow="0" w:noHBand="0" w:noVBand="1" w:val="04A0"/>
       </w:tblPr>
       <w:tblGrid>
-        <w:gridCol w:w="2353"/>
-        <w:gridCol w:w="2353"/>
-        <w:gridCol w:w="2353"/>
-        <w:gridCol w:w="2353"/>
+        <w:gridCol w:w="1247"/>
+        <w:gridCol w:w="3742"/>
+        <w:gridCol w:w="3288"/>
+        <w:gridCol w:w="1247"/>
       </w:tblGrid>
       <w:tr>
+        <w:trPr>
+          <w:tblHeader/>
+        </w:trPr>
         <w:tc>
           <w:tcPr>
             <w:tcW w:type="dxa" w:w="1247"/>
+            <w:shd w:val="clear" w:fill="D9E2F3"/>
           </w:tcPr>
           <w:p>
-            <w:r/>
+            <w:r>
+              <w:rPr>
+                <w:b/>
+              </w:rPr>
+            </w:r>
             <w:r>
               <w:rPr>
                 <w:rFonts w:ascii="Arial" w:hAnsi="Arial" w:eastAsia="PingFang SC"/>
@@ -881,10 +1018,15 @@
         </w:tc>
         <w:tc>
           <w:tcPr>
-            <w:tcW w:type="dxa" w:w="3628"/>
+            <w:tcW w:type="dxa" w:w="3742"/>
+            <w:shd w:val="clear" w:fill="D9E2F3"/>
           </w:tcPr>
           <w:p>
-            <w:r/>
+            <w:r>
+              <w:rPr>
+                <w:b/>
+              </w:rPr>
+            </w:r>
             <w:r>
               <w:rPr>
                 <w:rFonts w:ascii="Arial" w:hAnsi="Arial" w:eastAsia="PingFang SC"/>
@@ -897,10 +1039,15 @@
         </w:tc>
         <w:tc>
           <w:tcPr>
-            <w:tcW w:type="dxa" w:w="3061"/>
+            <w:tcW w:type="dxa" w:w="3288"/>
+            <w:shd w:val="clear" w:fill="D9E2F3"/>
           </w:tcPr>
           <w:p>
-            <w:r/>
+            <w:r>
+              <w:rPr>
+                <w:b/>
+              </w:rPr>
+            </w:r>
             <w:r>
               <w:rPr>
                 <w:rFonts w:ascii="Arial" w:hAnsi="Arial" w:eastAsia="PingFang SC"/>
@@ -913,10 +1060,15 @@
         </w:tc>
         <w:tc>
           <w:tcPr>
-            <w:tcW w:type="dxa" w:w="1134"/>
+            <w:tcW w:type="dxa" w:w="1247"/>
+            <w:shd w:val="clear" w:fill="D9E2F3"/>
           </w:tcPr>
           <w:p>
-            <w:r/>
+            <w:r>
+              <w:rPr>
+                <w:b/>
+              </w:rPr>
+            </w:r>
             <w:r>
               <w:rPr>
                 <w:rFonts w:ascii="Arial" w:hAnsi="Arial" w:eastAsia="PingFang SC"/>
@@ -947,7 +1099,7 @@
         </w:tc>
         <w:tc>
           <w:tcPr>
-            <w:tcW w:type="dxa" w:w="3628"/>
+            <w:tcW w:type="dxa" w:w="3742"/>
           </w:tcPr>
           <w:p>
             <w:r/>
@@ -963,7 +1115,7 @@
         </w:tc>
         <w:tc>
           <w:tcPr>
-            <w:tcW w:type="dxa" w:w="3061"/>
+            <w:tcW w:type="dxa" w:w="3288"/>
           </w:tcPr>
           <w:p>
             <w:r/>
@@ -979,7 +1131,7 @@
         </w:tc>
         <w:tc>
           <w:tcPr>
-            <w:tcW w:type="dxa" w:w="1134"/>
+            <w:tcW w:type="dxa" w:w="1247"/>
           </w:tcPr>
           <w:p>
             <w:r/>
@@ -1013,7 +1165,7 @@
         </w:tc>
         <w:tc>
           <w:tcPr>
-            <w:tcW w:type="dxa" w:w="3628"/>
+            <w:tcW w:type="dxa" w:w="3742"/>
           </w:tcPr>
           <w:p>
             <w:r/>
@@ -1029,7 +1181,7 @@
         </w:tc>
         <w:tc>
           <w:tcPr>
-            <w:tcW w:type="dxa" w:w="3061"/>
+            <w:tcW w:type="dxa" w:w="3288"/>
           </w:tcPr>
           <w:p>
             <w:r/>
@@ -1045,7 +1197,7 @@
         </w:tc>
         <w:tc>
           <w:tcPr>
-            <w:tcW w:type="dxa" w:w="1134"/>
+            <w:tcW w:type="dxa" w:w="1247"/>
           </w:tcPr>
           <w:p>
             <w:r/>
@@ -1079,7 +1231,7 @@
         </w:tc>
         <w:tc>
           <w:tcPr>
-            <w:tcW w:type="dxa" w:w="3628"/>
+            <w:tcW w:type="dxa" w:w="3742"/>
           </w:tcPr>
           <w:p>
             <w:r/>
@@ -1095,7 +1247,7 @@
         </w:tc>
         <w:tc>
           <w:tcPr>
-            <w:tcW w:type="dxa" w:w="3061"/>
+            <w:tcW w:type="dxa" w:w="3288"/>
           </w:tcPr>
           <w:p>
             <w:r/>
@@ -1111,7 +1263,7 @@
         </w:tc>
         <w:tc>
           <w:tcPr>
-            <w:tcW w:type="dxa" w:w="1134"/>
+            <w:tcW w:type="dxa" w:w="1247"/>
           </w:tcPr>
           <w:p>
             <w:r/>
@@ -1145,7 +1297,7 @@
         </w:tc>
         <w:tc>
           <w:tcPr>
-            <w:tcW w:type="dxa" w:w="3628"/>
+            <w:tcW w:type="dxa" w:w="3742"/>
           </w:tcPr>
           <w:p>
             <w:r/>
@@ -1161,7 +1313,7 @@
         </w:tc>
         <w:tc>
           <w:tcPr>
-            <w:tcW w:type="dxa" w:w="3061"/>
+            <w:tcW w:type="dxa" w:w="3288"/>
           </w:tcPr>
           <w:p>
             <w:r/>
@@ -1177,7 +1329,7 @@
         </w:tc>
         <w:tc>
           <w:tcPr>
-            <w:tcW w:type="dxa" w:w="1134"/>
+            <w:tcW w:type="dxa" w:w="1247"/>
           </w:tcPr>
           <w:p>
             <w:r/>
@@ -1211,7 +1363,7 @@
         </w:tc>
         <w:tc>
           <w:tcPr>
-            <w:tcW w:type="dxa" w:w="3628"/>
+            <w:tcW w:type="dxa" w:w="3742"/>
           </w:tcPr>
           <w:p>
             <w:r/>
@@ -1227,7 +1379,7 @@
         </w:tc>
         <w:tc>
           <w:tcPr>
-            <w:tcW w:type="dxa" w:w="3061"/>
+            <w:tcW w:type="dxa" w:w="3288"/>
           </w:tcPr>
           <w:p>
             <w:r/>
@@ -1243,7 +1395,7 @@
         </w:tc>
         <w:tc>
           <w:tcPr>
-            <w:tcW w:type="dxa" w:w="1134"/>
+            <w:tcW w:type="dxa" w:w="1247"/>
           </w:tcPr>
           <w:p>
             <w:r/>
@@ -1253,7 +1405,7 @@
                 <w:b w:val="0"/>
                 <w:sz w:val="18"/>
               </w:rPr>
-              <w:t>更强调 Human-in-the-Loop</w:t>
+              <w:t>更强调人工确认</w:t>
             </w:r>
           </w:p>
         </w:tc>
@@ -1274,7 +1426,7 @@
           <w:b w:val="0"/>
           <w:sz w:val="19"/>
         </w:rPr>
-        <w:t>说明：参考版的实时多卡检测与连拍属于拍摄上游能力，本项目按作业第三节要求实现「自动检测边界 + 手动调整 + 透视校正」，检测放在拍摄后独立页面完成，属于可接受的实现路径差异。</w:t>
+        <w:t>说明：参考版的实时多卡检测与连拍属于拍摄上游能力；本项目按作业第三节要求实现「自动检测边界 + 手动调整 + 透视校正」，检测放在拍摄后的独立页面完成，属可接受的实现路径差异。</w:t>
       </w:r>
     </w:p>
     <w:p>
@@ -1283,8 +1435,14 @@
       </w:pPr>
       <w:r>
         <w:rPr>
+          <w:b/>
+        </w:rPr>
+      </w:r>
+      <w:r>
+        <w:rPr>
           <w:rFonts w:ascii="Arial" w:hAnsi="Arial" w:eastAsia="PingFang SC"/>
           <w:b/>
+          <w:sz w:val="34"/>
         </w:rPr>
         <w:t>4  对比二：名片夹 / 名片管理</w:t>
       </w:r>
@@ -1293,16 +1451,17 @@
       <w:tblPr>
         <w:tblW w:type="auto" w:w="0"/>
         <w:jc w:val="center"/>
+        <w:tblLayout w:type="fixed"/>
         <w:tblLook w:firstColumn="1" w:firstRow="1" w:lastColumn="0" w:lastRow="0" w:noHBand="0" w:noVBand="1" w:val="04A0"/>
       </w:tblPr>
       <w:tblGrid>
-        <w:gridCol w:w="4706"/>
-        <w:gridCol w:w="4706"/>
+        <w:gridCol w:w="4819"/>
+        <w:gridCol w:w="4819"/>
       </w:tblGrid>
       <w:tr>
         <w:tc>
           <w:tcPr>
-            <w:tcW w:type="dxa" w:w="4706"/>
+            <w:tcW w:type="dxa" w:w="4819"/>
           </w:tcPr>
           <w:p>
             <w:pPr>
@@ -1312,7 +1471,7 @@
             <w:r>
               <w:drawing>
                 <wp:inline xmlns:a="http://schemas.openxmlformats.org/drawingml/2006/main" xmlns:pic="http://schemas.openxmlformats.org/drawingml/2006/picture">
-                  <wp:extent cx="1944000" cy="3451592"/>
+                  <wp:extent cx="2015999" cy="3579427"/>
                   <wp:docPr id="3" name="Picture 3"/>
                   <wp:cNvGraphicFramePr>
                     <a:graphicFrameLocks noChangeAspect="1"/>
@@ -1333,7 +1492,7 @@
                         <pic:spPr>
                           <a:xfrm>
                             <a:off x="0" y="0"/>
-                            <a:ext cx="1944000" cy="3451592"/>
+                            <a:ext cx="2015999" cy="3579427"/>
                           </a:xfrm>
                           <a:prstGeom prst="rect"/>
                         </pic:spPr>
@@ -1347,7 +1506,7 @@
         </w:tc>
         <w:tc>
           <w:tcPr>
-            <w:tcW w:type="dxa" w:w="4706"/>
+            <w:tcW w:type="dxa" w:w="4819"/>
           </w:tcPr>
           <w:p>
             <w:pPr>
@@ -1357,7 +1516,7 @@
             <w:r>
               <w:drawing>
                 <wp:inline xmlns:a="http://schemas.openxmlformats.org/drawingml/2006/main" xmlns:pic="http://schemas.openxmlformats.org/drawingml/2006/picture">
-                  <wp:extent cx="1728000" cy="3756895"/>
+                  <wp:extent cx="1764000" cy="3835164"/>
                   <wp:docPr id="4" name="Picture 4"/>
                   <wp:cNvGraphicFramePr>
                     <a:graphicFrameLocks noChangeAspect="1"/>
@@ -1378,7 +1537,7 @@
                         <pic:spPr>
                           <a:xfrm>
                             <a:off x="0" y="0"/>
-                            <a:ext cx="1728000" cy="3756895"/>
+                            <a:ext cx="1764000" cy="3835164"/>
                           </a:xfrm>
                           <a:prstGeom prst="rect"/>
                         </pic:spPr>
@@ -1394,7 +1553,7 @@
       <w:tr>
         <w:tc>
           <w:tcPr>
-            <w:tcW w:type="dxa" w:w="4706"/>
+            <w:tcW w:type="dxa" w:w="4819"/>
           </w:tcPr>
           <w:p>
             <w:pPr>
@@ -1413,7 +1572,7 @@
         </w:tc>
         <w:tc>
           <w:tcPr>
-            <w:tcW w:type="dxa" w:w="4706"/>
+            <w:tcW w:type="dxa" w:w="4819"/>
           </w:tcPr>
           <w:p>
             <w:pPr>
@@ -1440,23 +1599,40 @@
     <w:tbl>
       <w:tblPr>
         <w:tblStyle w:val="TableGrid"/>
-        <w:tblW w:type="auto" w:w="0"/>
+        <w:tblW w:type="dxa" w:w="9526"/>
         <w:jc w:val="center"/>
+        <w:tblBorders>
+          <w:top w:val="single" w:sz="4" w:space="0" w:color="808080"/>
+          <w:left w:val="single" w:sz="4" w:space="0" w:color="808080"/>
+          <w:bottom w:val="single" w:sz="4" w:space="0" w:color="808080"/>
+          <w:right w:val="single" w:sz="4" w:space="0" w:color="808080"/>
+          <w:insideH w:val="single" w:sz="4" w:space="0" w:color="808080"/>
+          <w:insideV w:val="single" w:sz="4" w:space="0" w:color="808080"/>
+        </w:tblBorders>
+        <w:tblLayout w:type="fixed"/>
         <w:tblLook w:firstColumn="1" w:firstRow="1" w:lastColumn="0" w:lastRow="0" w:noHBand="0" w:noVBand="1" w:val="04A0"/>
       </w:tblPr>
       <w:tblGrid>
-        <w:gridCol w:w="2353"/>
-        <w:gridCol w:w="2353"/>
-        <w:gridCol w:w="2353"/>
-        <w:gridCol w:w="2353"/>
+        <w:gridCol w:w="1247"/>
+        <w:gridCol w:w="3742"/>
+        <w:gridCol w:w="3288"/>
+        <w:gridCol w:w="1247"/>
       </w:tblGrid>
       <w:tr>
+        <w:trPr>
+          <w:tblHeader/>
+        </w:trPr>
         <w:tc>
           <w:tcPr>
             <w:tcW w:type="dxa" w:w="1247"/>
+            <w:shd w:val="clear" w:fill="D9E2F3"/>
           </w:tcPr>
           <w:p>
-            <w:r/>
+            <w:r>
+              <w:rPr>
+                <w:b/>
+              </w:rPr>
+            </w:r>
             <w:r>
               <w:rPr>
                 <w:rFonts w:ascii="Arial" w:hAnsi="Arial" w:eastAsia="PingFang SC"/>
@@ -1469,10 +1645,15 @@
         </w:tc>
         <w:tc>
           <w:tcPr>
-            <w:tcW w:type="dxa" w:w="3628"/>
+            <w:tcW w:type="dxa" w:w="3742"/>
+            <w:shd w:val="clear" w:fill="D9E2F3"/>
           </w:tcPr>
           <w:p>
-            <w:r/>
+            <w:r>
+              <w:rPr>
+                <w:b/>
+              </w:rPr>
+            </w:r>
             <w:r>
               <w:rPr>
                 <w:rFonts w:ascii="Arial" w:hAnsi="Arial" w:eastAsia="PingFang SC"/>
@@ -1485,10 +1666,15 @@
         </w:tc>
         <w:tc>
           <w:tcPr>
-            <w:tcW w:type="dxa" w:w="3061"/>
+            <w:tcW w:type="dxa" w:w="3288"/>
+            <w:shd w:val="clear" w:fill="D9E2F3"/>
           </w:tcPr>
           <w:p>
-            <w:r/>
+            <w:r>
+              <w:rPr>
+                <w:b/>
+              </w:rPr>
+            </w:r>
             <w:r>
               <w:rPr>
                 <w:rFonts w:ascii="Arial" w:hAnsi="Arial" w:eastAsia="PingFang SC"/>
@@ -1501,10 +1687,15 @@
         </w:tc>
         <w:tc>
           <w:tcPr>
-            <w:tcW w:type="dxa" w:w="1134"/>
+            <w:tcW w:type="dxa" w:w="1247"/>
+            <w:shd w:val="clear" w:fill="D9E2F3"/>
           </w:tcPr>
           <w:p>
-            <w:r/>
+            <w:r>
+              <w:rPr>
+                <w:b/>
+              </w:rPr>
+            </w:r>
             <w:r>
               <w:rPr>
                 <w:rFonts w:ascii="Arial" w:hAnsi="Arial" w:eastAsia="PingFang SC"/>
@@ -1535,7 +1726,7 @@
         </w:tc>
         <w:tc>
           <w:tcPr>
-            <w:tcW w:type="dxa" w:w="3628"/>
+            <w:tcW w:type="dxa" w:w="3742"/>
           </w:tcPr>
           <w:p>
             <w:r/>
@@ -1545,13 +1736,13 @@
                 <w:b w:val="0"/>
                 <w:sz w:val="18"/>
               </w:rPr>
-              <w:t>顶部常驻搜索框（姓名、公司、职位搜索）+ 消息 + 添加；四个功能入口（新的人脉/分组管理/人脉地图/人脉分析）；「我的名片(50张)」+ 管理面板</w:t>
+              <w:t>顶部常驻搜索框 + 消息 + 添加；四个功能入口（新的人脉/分组管理/人脉地图/人脉分析）；「我的名片(50张)」+ 管理面板</w:t>
             </w:r>
           </w:p>
         </w:tc>
         <w:tc>
           <w:tcPr>
-            <w:tcW w:type="dxa" w:w="3061"/>
+            <w:tcW w:type="dxa" w:w="3288"/>
           </w:tcPr>
           <w:p>
             <w:r/>
@@ -1567,7 +1758,7 @@
         </w:tc>
         <w:tc>
           <w:tcPr>
-            <w:tcW w:type="dxa" w:w="1134"/>
+            <w:tcW w:type="dxa" w:w="1247"/>
           </w:tcPr>
           <w:p>
             <w:r/>
@@ -1601,7 +1792,7 @@
         </w:tc>
         <w:tc>
           <w:tcPr>
-            <w:tcW w:type="dxa" w:w="3628"/>
+            <w:tcW w:type="dxa" w:w="3742"/>
           </w:tcPr>
           <w:p>
             <w:r/>
@@ -1617,7 +1808,7 @@
         </w:tc>
         <w:tc>
           <w:tcPr>
-            <w:tcW w:type="dxa" w:w="3061"/>
+            <w:tcW w:type="dxa" w:w="3288"/>
           </w:tcPr>
           <w:p>
             <w:r/>
@@ -1633,7 +1824,7 @@
         </w:tc>
         <w:tc>
           <w:tcPr>
-            <w:tcW w:type="dxa" w:w="1134"/>
+            <w:tcW w:type="dxa" w:w="1247"/>
           </w:tcPr>
           <w:p>
             <w:r/>
@@ -1667,7 +1858,7 @@
         </w:tc>
         <w:tc>
           <w:tcPr>
-            <w:tcW w:type="dxa" w:w="3628"/>
+            <w:tcW w:type="dxa" w:w="3742"/>
           </w:tcPr>
           <w:p>
             <w:r/>
@@ -1683,7 +1874,7 @@
         </w:tc>
         <w:tc>
           <w:tcPr>
-            <w:tcW w:type="dxa" w:w="3061"/>
+            <w:tcW w:type="dxa" w:w="3288"/>
           </w:tcPr>
           <w:p>
             <w:r/>
@@ -1699,7 +1890,7 @@
         </w:tc>
         <w:tc>
           <w:tcPr>
-            <w:tcW w:type="dxa" w:w="1134"/>
+            <w:tcW w:type="dxa" w:w="1247"/>
           </w:tcPr>
           <w:p>
             <w:r/>
@@ -1733,7 +1924,7 @@
         </w:tc>
         <w:tc>
           <w:tcPr>
-            <w:tcW w:type="dxa" w:w="3628"/>
+            <w:tcW w:type="dxa" w:w="3742"/>
           </w:tcPr>
           <w:p>
             <w:r/>
@@ -1749,7 +1940,7 @@
         </w:tc>
         <w:tc>
           <w:tcPr>
-            <w:tcW w:type="dxa" w:w="3061"/>
+            <w:tcW w:type="dxa" w:w="3288"/>
           </w:tcPr>
           <w:p>
             <w:r/>
@@ -1765,7 +1956,7 @@
         </w:tc>
         <w:tc>
           <w:tcPr>
-            <w:tcW w:type="dxa" w:w="1134"/>
+            <w:tcW w:type="dxa" w:w="1247"/>
           </w:tcPr>
           <w:p>
             <w:r/>
@@ -1799,7 +1990,7 @@
         </w:tc>
         <w:tc>
           <w:tcPr>
-            <w:tcW w:type="dxa" w:w="3628"/>
+            <w:tcW w:type="dxa" w:w="3742"/>
           </w:tcPr>
           <w:p>
             <w:r/>
@@ -1815,7 +2006,7 @@
         </w:tc>
         <w:tc>
           <w:tcPr>
-            <w:tcW w:type="dxa" w:w="3061"/>
+            <w:tcW w:type="dxa" w:w="3288"/>
           </w:tcPr>
           <w:p>
             <w:r/>
@@ -1831,7 +2022,7 @@
         </w:tc>
         <w:tc>
           <w:tcPr>
-            <w:tcW w:type="dxa" w:w="1134"/>
+            <w:tcW w:type="dxa" w:w="1247"/>
           </w:tcPr>
           <w:p>
             <w:r/>
@@ -1865,7 +2056,7 @@
         </w:tc>
         <w:tc>
           <w:tcPr>
-            <w:tcW w:type="dxa" w:w="3628"/>
+            <w:tcW w:type="dxa" w:w="3742"/>
           </w:tcPr>
           <w:p>
             <w:r/>
@@ -1881,7 +2072,7 @@
         </w:tc>
         <w:tc>
           <w:tcPr>
-            <w:tcW w:type="dxa" w:w="3061"/>
+            <w:tcW w:type="dxa" w:w="3288"/>
           </w:tcPr>
           <w:p>
             <w:r/>
@@ -1897,7 +2088,7 @@
         </w:tc>
         <w:tc>
           <w:tcPr>
-            <w:tcW w:type="dxa" w:w="1134"/>
+            <w:tcW w:type="dxa" w:w="1247"/>
           </w:tcPr>
           <w:p>
             <w:r/>
@@ -1928,7 +2119,7 @@
           <w:b w:val="0"/>
           <w:sz w:val="19"/>
         </w:rPr>
-        <w:t>说明：参考版的分组管理对应本项目的标签体系；人脉地图、人脉分析、名片去重、100% 识别、回收站、一键同步属于作业第十五节明确不要求复刻的功能，未实现属合规。</w:t>
+        <w:t>说明：参考版的分组管理对应本项目标签体系；人脉地图、人脉分析、名片去重、100% 识别、回收站、一键同步属作业第十五节明确不要求复刻的功能，未实现属合规。</w:t>
       </w:r>
     </w:p>
     <w:p>
@@ -1937,8 +2128,14 @@
       </w:pPr>
       <w:r>
         <w:rPr>
+          <w:b/>
+        </w:rPr>
+      </w:r>
+      <w:r>
+        <w:rPr>
           <w:rFonts w:ascii="Arial" w:hAnsi="Arial" w:eastAsia="PingFang SC"/>
           <w:b/>
+          <w:sz w:val="34"/>
         </w:rPr>
         <w:t>5  参考版其余页面（作业明确不要求复刻）</w:t>
       </w:r>
@@ -1953,29 +2150,46 @@
           <w:b w:val="0"/>
           <w:sz w:val="19"/>
         </w:rPr>
-        <w:t>官方截图中还有以下 4 个页面。按作业第十五节「明确不要求复刻的功能」，这些不在本次范围内，仅记录以便评审确认范围边界：</w:t>
+        <w:t>官方截图中还有 5 个页面不在本次范围内，仅记录以便评审确认范围边界：</w:t>
       </w:r>
     </w:p>
     <w:tbl>
       <w:tblPr>
         <w:tblStyle w:val="TableGrid"/>
-        <w:tblW w:type="auto" w:w="0"/>
+        <w:tblW w:type="dxa" w:w="9526"/>
         <w:jc w:val="center"/>
+        <w:tblBorders>
+          <w:top w:val="single" w:sz="4" w:space="0" w:color="808080"/>
+          <w:left w:val="single" w:sz="4" w:space="0" w:color="808080"/>
+          <w:bottom w:val="single" w:sz="4" w:space="0" w:color="808080"/>
+          <w:right w:val="single" w:sz="4" w:space="0" w:color="808080"/>
+          <w:insideH w:val="single" w:sz="4" w:space="0" w:color="808080"/>
+          <w:insideV w:val="single" w:sz="4" w:space="0" w:color="808080"/>
+        </w:tblBorders>
+        <w:tblLayout w:type="fixed"/>
         <w:tblLook w:firstColumn="1" w:firstRow="1" w:lastColumn="0" w:lastRow="0" w:noHBand="0" w:noVBand="1" w:val="04A0"/>
       </w:tblPr>
       <w:tblGrid>
-        <w:gridCol w:w="2353"/>
-        <w:gridCol w:w="2353"/>
-        <w:gridCol w:w="2353"/>
-        <w:gridCol w:w="2353"/>
+        <w:gridCol w:w="1701"/>
+        <w:gridCol w:w="1928"/>
+        <w:gridCol w:w="4195"/>
+        <w:gridCol w:w="1701"/>
       </w:tblGrid>
       <w:tr>
+        <w:trPr>
+          <w:tblHeader/>
+        </w:trPr>
         <w:tc>
           <w:tcPr>
             <w:tcW w:type="dxa" w:w="1701"/>
+            <w:shd w:val="clear" w:fill="D9E2F3"/>
           </w:tcPr>
           <w:p>
-            <w:r/>
+            <w:r>
+              <w:rPr>
+                <w:b/>
+              </w:rPr>
+            </w:r>
             <w:r>
               <w:rPr>
                 <w:rFonts w:ascii="Arial" w:hAnsi="Arial" w:eastAsia="PingFang SC"/>
@@ -1988,10 +2202,15 @@
         </w:tc>
         <w:tc>
           <w:tcPr>
-            <w:tcW w:type="dxa" w:w="1701"/>
+            <w:tcW w:type="dxa" w:w="1928"/>
+            <w:shd w:val="clear" w:fill="D9E2F3"/>
           </w:tcPr>
           <w:p>
-            <w:r/>
+            <w:r>
+              <w:rPr>
+                <w:b/>
+              </w:rPr>
+            </w:r>
             <w:r>
               <w:rPr>
                 <w:rFonts w:ascii="Arial" w:hAnsi="Arial" w:eastAsia="PingFang SC"/>
@@ -2005,9 +2224,14 @@
         <w:tc>
           <w:tcPr>
             <w:tcW w:type="dxa" w:w="4195"/>
+            <w:shd w:val="clear" w:fill="D9E2F3"/>
           </w:tcPr>
           <w:p>
-            <w:r/>
+            <w:r>
+              <w:rPr>
+                <w:b/>
+              </w:rPr>
+            </w:r>
             <w:r>
               <w:rPr>
                 <w:rFonts w:ascii="Arial" w:hAnsi="Arial" w:eastAsia="PingFang SC"/>
@@ -2020,10 +2244,15 @@
         </w:tc>
         <w:tc>
           <w:tcPr>
-            <w:tcW w:type="dxa" w:w="1928"/>
+            <w:tcW w:type="dxa" w:w="1701"/>
+            <w:shd w:val="clear" w:fill="D9E2F3"/>
           </w:tcPr>
           <w:p>
-            <w:r/>
+            <w:r>
+              <w:rPr>
+                <w:b/>
+              </w:rPr>
+            </w:r>
             <w:r>
               <w:rPr>
                 <w:rFonts w:ascii="Arial" w:hAnsi="Arial" w:eastAsia="PingFang SC"/>
@@ -2054,7 +2283,7 @@
         </w:tc>
         <w:tc>
           <w:tcPr>
-            <w:tcW w:type="dxa" w:w="1701"/>
+            <w:tcW w:type="dxa" w:w="1928"/>
           </w:tcPr>
           <w:p>
             <w:r/>
@@ -2086,7 +2315,7 @@
         </w:tc>
         <w:tc>
           <w:tcPr>
-            <w:tcW w:type="dxa" w:w="1928"/>
+            <w:tcW w:type="dxa" w:w="1701"/>
           </w:tcPr>
           <w:p>
             <w:r/>
@@ -2120,7 +2349,7 @@
         </w:tc>
         <w:tc>
           <w:tcPr>
-            <w:tcW w:type="dxa" w:w="1701"/>
+            <w:tcW w:type="dxa" w:w="1928"/>
           </w:tcPr>
           <w:p>
             <w:r/>
@@ -2152,7 +2381,7 @@
         </w:tc>
         <w:tc>
           <w:tcPr>
-            <w:tcW w:type="dxa" w:w="1928"/>
+            <w:tcW w:type="dxa" w:w="1701"/>
           </w:tcPr>
           <w:p>
             <w:r/>
@@ -2186,7 +2415,7 @@
         </w:tc>
         <w:tc>
           <w:tcPr>
-            <w:tcW w:type="dxa" w:w="1701"/>
+            <w:tcW w:type="dxa" w:w="1928"/>
           </w:tcPr>
           <w:p>
             <w:r/>
@@ -2218,7 +2447,7 @@
         </w:tc>
         <w:tc>
           <w:tcPr>
-            <w:tcW w:type="dxa" w:w="1928"/>
+            <w:tcW w:type="dxa" w:w="1701"/>
           </w:tcPr>
           <w:p>
             <w:r/>
@@ -2252,7 +2481,7 @@
         </w:tc>
         <w:tc>
           <w:tcPr>
-            <w:tcW w:type="dxa" w:w="1701"/>
+            <w:tcW w:type="dxa" w:w="1928"/>
           </w:tcPr>
           <w:p>
             <w:r/>
@@ -2284,7 +2513,7 @@
         </w:tc>
         <w:tc>
           <w:tcPr>
-            <w:tcW w:type="dxa" w:w="1928"/>
+            <w:tcW w:type="dxa" w:w="1701"/>
           </w:tcPr>
           <w:p>
             <w:r/>
@@ -2318,7 +2547,7 @@
         </w:tc>
         <w:tc>
           <w:tcPr>
-            <w:tcW w:type="dxa" w:w="1701"/>
+            <w:tcW w:type="dxa" w:w="1928"/>
           </w:tcPr>
           <w:p>
             <w:r/>
@@ -2350,7 +2579,7 @@
         </w:tc>
         <w:tc>
           <w:tcPr>
-            <w:tcW w:type="dxa" w:w="1928"/>
+            <w:tcW w:type="dxa" w:w="1701"/>
           </w:tcPr>
           <w:p>
             <w:r/>
@@ -2377,8 +2606,14 @@
       </w:pPr>
       <w:r>
         <w:rPr>
+          <w:b/>
+        </w:rPr>
+      </w:r>
+      <w:r>
+        <w:rPr>
           <w:rFonts w:ascii="Arial" w:hAnsi="Arial" w:eastAsia="PingFang SC"/>
           <w:b/>
+          <w:sz w:val="34"/>
         </w:rPr>
         <w:t>6  结论与待办</w:t>
       </w:r>
@@ -2389,8 +2624,14 @@
       </w:pPr>
       <w:r>
         <w:rPr>
+          <w:b/>
+        </w:rPr>
+      </w:r>
+      <w:r>
+        <w:rPr>
           <w:rFonts w:ascii="Arial" w:hAnsi="Arial" w:eastAsia="PingFang SC"/>
           <w:b/>
+          <w:sz w:val="26"/>
         </w:rPr>
         <w:t>6.1  结论</w:t>
       </w:r>
@@ -2398,12 +2639,13 @@
     <w:p>
       <w:pPr>
         <w:pStyle w:val="ListBullet"/>
-        <w:spacing w:after="20"/>
+        <w:spacing w:after="40"/>
       </w:pPr>
       <w:r>
         <w:rPr>
           <w:rFonts w:ascii="Arial" w:hAnsi="Arial" w:eastAsia="PingFang SC"/>
           <w:b w:val="0"/>
+          <w:sz w:val="20"/>
         </w:rPr>
         <w:t>在作业要求的 10 项功能范围内，参考版可见的关键 UI 结构、交互路径与状态处理，本项目均有对应实现，未发现范围内缺失的必要入口。</w:t>
       </w:r>
@@ -2411,12 +2653,13 @@
     <w:p>
       <w:pPr>
         <w:pStyle w:val="ListBullet"/>
-        <w:spacing w:after="20"/>
+        <w:spacing w:after="40"/>
       </w:pPr>
       <w:r>
         <w:rPr>
           <w:rFonts w:ascii="Arial" w:hAnsi="Arial" w:eastAsia="PingFang SC"/>
           <w:b w:val="0"/>
+          <w:sz w:val="20"/>
         </w:rPr>
         <w:t>主要差异为布局组织（搜索常驻 vs 独立搜索页；右侧悬浮动作组 vs 底部工具栏）与拍摄链路（实时框选 vs 拍摄后检测页），均不改变任务可达性与数据结果。</w:t>
       </w:r>
@@ -2424,12 +2667,13 @@
     <w:p>
       <w:pPr>
         <w:pStyle w:val="ListBullet"/>
-        <w:spacing w:after="20"/>
+        <w:spacing w:after="40"/>
       </w:pPr>
       <w:r>
         <w:rPr>
           <w:rFonts w:ascii="Arial" w:hAnsi="Arial" w:eastAsia="PingFang SC"/>
           <w:b w:val="0"/>
+          <w:sz w:val="20"/>
         </w:rPr>
         <w:t>参考版大量功能属于作业第十五节排除项，本项目的功能裁剪符合要求。</w:t>
       </w:r>
@@ -2440,8 +2684,14 @@
       </w:pPr>
       <w:r>
         <w:rPr>
+          <w:b/>
+        </w:rPr>
+      </w:r>
+      <w:r>
+        <w:rPr>
           <w:rFonts w:ascii="Arial" w:hAnsi="Arial" w:eastAsia="PingFang SC"/>
           <w:b/>
+          <w:sz w:val="26"/>
         </w:rPr>
         <w:t>6.2  仍未覆盖的部分（如实说明）</w:t>
       </w:r>
@@ -2449,12 +2699,13 @@
     <w:p>
       <w:pPr>
         <w:pStyle w:val="ListBullet"/>
-        <w:spacing w:after="20"/>
+        <w:spacing w:after="40"/>
       </w:pPr>
       <w:r>
         <w:rPr>
           <w:rFonts w:ascii="Arial" w:hAnsi="Arial" w:eastAsia="PingFang SC"/>
           <w:b w:val="0"/>
+          <w:sz w:val="20"/>
         </w:rPr>
         <w:t>详情页、OCR 原始文本页、字段校正页、编辑页：官方商店截图未展示这些页面，无法从公开素材对比。</w:t>
       </w:r>
@@ -2462,12 +2713,13 @@
     <w:p>
       <w:pPr>
         <w:pStyle w:val="ListBullet"/>
-        <w:spacing w:after="20"/>
+        <w:spacing w:after="40"/>
       </w:pPr>
       <w:r>
         <w:rPr>
           <w:rFonts w:ascii="Arial" w:hAnsi="Arial" w:eastAsia="PingFang SC"/>
           <w:b w:val="0"/>
+          <w:sz w:val="20"/>
         </w:rPr>
         <w:t>教师锁定版本若与 8.65.0 不同，需以锁定版本重新对照。</w:t>
       </w:r>
@@ -2475,14 +2727,15 @@
     <w:p>
       <w:pPr>
         <w:pStyle w:val="ListBullet"/>
-        <w:spacing w:after="20"/>
+        <w:spacing w:after="40"/>
       </w:pPr>
       <w:r>
         <w:rPr>
           <w:rFonts w:ascii="Arial" w:hAnsi="Arial" w:eastAsia="PingFang SC"/>
           <w:b w:val="0"/>
+          <w:sz w:val="20"/>
         </w:rPr>
-        <w:t>建议：教师在真机安装锁定版本后，补拍上述 6 个页面的原始截图，替换本报告参考图后即可形成完整的 UI Golden Test。</w:t>
+        <w:t>建议：教师在真机安装锁定版本后，补拍上述页面的原始截图，替换本报告参考图后即可形成完整的 UI Golden Test。</w:t>
       </w:r>
     </w:p>
     <w:p>
@@ -2491,8 +2744,14 @@
       </w:pPr>
       <w:r>
         <w:rPr>
+          <w:b/>
+        </w:rPr>
+      </w:r>
+      <w:r>
+        <w:rPr>
           <w:rFonts w:ascii="Arial" w:hAnsi="Arial" w:eastAsia="PingFang SC"/>
           <w:b/>
+          <w:sz w:val="26"/>
         </w:rPr>
         <w:t>6.3  待办</w:t>
       </w:r>
@@ -2500,22 +2759,39 @@
     <w:tbl>
       <w:tblPr>
         <w:tblStyle w:val="TableGrid"/>
-        <w:tblW w:type="auto" w:w="0"/>
+        <w:tblW w:type="dxa" w:w="9526"/>
         <w:jc w:val="center"/>
+        <w:tblBorders>
+          <w:top w:val="single" w:sz="4" w:space="0" w:color="808080"/>
+          <w:left w:val="single" w:sz="4" w:space="0" w:color="808080"/>
+          <w:bottom w:val="single" w:sz="4" w:space="0" w:color="808080"/>
+          <w:right w:val="single" w:sz="4" w:space="0" w:color="808080"/>
+          <w:insideH w:val="single" w:sz="4" w:space="0" w:color="808080"/>
+          <w:insideV w:val="single" w:sz="4" w:space="0" w:color="808080"/>
+        </w:tblBorders>
+        <w:tblLayout w:type="fixed"/>
         <w:tblLook w:firstColumn="1" w:firstRow="1" w:lastColumn="0" w:lastRow="0" w:noHBand="0" w:noVBand="1" w:val="04A0"/>
       </w:tblPr>
       <w:tblGrid>
-        <w:gridCol w:w="3137"/>
-        <w:gridCol w:w="3137"/>
-        <w:gridCol w:w="3137"/>
+        <w:gridCol w:w="6236"/>
+        <w:gridCol w:w="1474"/>
+        <w:gridCol w:w="1814"/>
       </w:tblGrid>
       <w:tr>
+        <w:trPr>
+          <w:tblHeader/>
+        </w:trPr>
         <w:tc>
           <w:tcPr>
-            <w:tcW w:type="dxa" w:w="5896"/>
+            <w:tcW w:type="dxa" w:w="6236"/>
+            <w:shd w:val="clear" w:fill="D9E2F3"/>
           </w:tcPr>
           <w:p>
-            <w:r/>
+            <w:r>
+              <w:rPr>
+                <w:b/>
+              </w:rPr>
+            </w:r>
             <w:r>
               <w:rPr>
                 <w:rFonts w:ascii="Arial" w:hAnsi="Arial" w:eastAsia="PingFang SC"/>
@@ -2529,9 +2805,14 @@
         <w:tc>
           <w:tcPr>
             <w:tcW w:type="dxa" w:w="1474"/>
+            <w:shd w:val="clear" w:fill="D9E2F3"/>
           </w:tcPr>
           <w:p>
-            <w:r/>
+            <w:r>
+              <w:rPr>
+                <w:b/>
+              </w:rPr>
+            </w:r>
             <w:r>
               <w:rPr>
                 <w:rFonts w:ascii="Arial" w:hAnsi="Arial" w:eastAsia="PingFang SC"/>
@@ -2544,10 +2825,15 @@
         </w:tc>
         <w:tc>
           <w:tcPr>
-            <w:tcW w:type="dxa" w:w="1587"/>
+            <w:tcW w:type="dxa" w:w="1814"/>
+            <w:shd w:val="clear" w:fill="D9E2F3"/>
           </w:tcPr>
           <w:p>
-            <w:r/>
+            <w:r>
+              <w:rPr>
+                <w:b/>
+              </w:rPr>
+            </w:r>
             <w:r>
               <w:rPr>
                 <w:rFonts w:ascii="Arial" w:hAnsi="Arial" w:eastAsia="PingFang SC"/>
@@ -2562,7 +2848,7 @@
       <w:tr>
         <w:tc>
           <w:tcPr>
-            <w:tcW w:type="dxa" w:w="5896"/>
+            <w:tcW w:type="dxa" w:w="6236"/>
           </w:tcPr>
           <w:p>
             <w:r/>
@@ -2594,7 +2880,7 @@
         </w:tc>
         <w:tc>
           <w:tcPr>
-            <w:tcW w:type="dxa" w:w="1587"/>
+            <w:tcW w:type="dxa" w:w="1814"/>
           </w:tcPr>
           <w:p>
             <w:r/>
@@ -2612,7 +2898,7 @@
       <w:tr>
         <w:tc>
           <w:tcPr>
-            <w:tcW w:type="dxa" w:w="5896"/>
+            <w:tcW w:type="dxa" w:w="6236"/>
           </w:tcPr>
           <w:p>
             <w:r/>
@@ -2644,7 +2930,7 @@
         </w:tc>
         <w:tc>
           <w:tcPr>
-            <w:tcW w:type="dxa" w:w="1587"/>
+            <w:tcW w:type="dxa" w:w="1814"/>
           </w:tcPr>
           <w:p>
             <w:r/>
@@ -2662,7 +2948,7 @@
       <w:tr>
         <w:tc>
           <w:tcPr>
-            <w:tcW w:type="dxa" w:w="5896"/>
+            <w:tcW w:type="dxa" w:w="6236"/>
           </w:tcPr>
           <w:p>
             <w:r/>
@@ -2694,7 +2980,7 @@
         </w:tc>
         <w:tc>
           <w:tcPr>
-            <w:tcW w:type="dxa" w:w="1587"/>
+            <w:tcW w:type="dxa" w:w="1814"/>
           </w:tcPr>
           <w:p>
             <w:r/>
@@ -2731,7 +3017,7 @@
     </w:p>
     <w:sectPr>
       <w:pgSz w:w="11906" w:h="16838"/>
-      <w:pgMar w:top="1247" w:right="1247" w:bottom="1247" w:left="1247" w:header="720" w:footer="720" w:gutter="0"/>
+      <w:pgMar w:top="1134" w:right="1134" w:bottom="1134" w:left="1134" w:header="720" w:footer="720" w:gutter="0"/>
       <w:cols w:space="720"/>
       <w:docGrid w:linePitch="360"/>
     </w:sectPr>

</xml_diff>

<commit_message>
docs: supplement black-box observation gaps with official INTSIG manuals
Recording only covered 11 scenarios of CamScanner. Boundary detection,
card detail, search and tags now have second-hand evidence from official
CamScanner/CamCard user manuals, clearly marked as non-firsthand and
non-usable for pixel-level UI comparison. Persistence stays blank.
</commit_message>
<xml_diff>
--- a/UI截图对比报告.docx
+++ b/UI截图对比报告.docx
@@ -2707,7 +2707,14 @@
           <w:b w:val="0"/>
           <w:sz w:val="20"/>
         </w:rPr>
-        <w:t>详情页、OCR 原始文本页、字段校正页、编辑页：官方商店截图未展示这些页面，无法从公开素材对比。</w:t>
+      </w:r>
+      <w:r>
+        <w:rPr>
+          <w:rFonts w:ascii="Arial" w:hAnsi="Arial" w:eastAsia="PingFang SC"/>
+          <w:b w:val="0"/>
+          <w:sz w:val="20"/>
+        </w:rPr>
+        <w:t>详情页、OCR 原始文本页、字段校正页、编辑页：官方商店截图未展示；其中详情页、识别结果编辑与搜索已用 INTSIG 官方手册做文字补充（见第 7 节），仍无参考截图。</w:t>
       </w:r>
     </w:p>
     <w:p>
@@ -3002,6 +3009,495 @@
       </w:pPr>
     </w:p>
     <w:p/>
+    <w:p>
+      <w:pPr>
+        <w:jc w:val="right"/>
+      </w:pPr>
+      <w:r>
+        <w:rPr>
+          <w:rFonts w:ascii="Arial" w:hAnsi="Arial" w:eastAsia="PingFang SC"/>
+          <w:b w:val="0"/>
+          <w:sz w:val="19"/>
+        </w:rPr>
+        <w:t>BlackBox 项目组 · 2026-10-28</w:t>
+      </w:r>
+    </w:p>
+    <w:p>
+      <w:pPr>
+        <w:pStyle w:val="Heading1"/>
+      </w:pPr>
+      <w:r>
+        <w:rPr>
+          <w:b/>
+        </w:rPr>
+      </w:r>
+      <w:r>
+        <w:rPr>
+          <w:rFonts w:ascii="Arial" w:hAnsi="Arial" w:eastAsia="PingFang SC"/>
+          <w:b/>
+          <w:sz w:val="34"/>
+        </w:rPr>
+        <w:t>7  补充对照：详情页 / 识别结果 / 搜索（官方手册，无截图）</w:t>
+      </w:r>
+    </w:p>
+    <w:p>
+      <w:r>
+        <w:rPr>
+          <w:rFonts w:ascii="Arial" w:hAnsi="Arial" w:eastAsia="PingFang SC"/>
+          <w:b w:val="0"/>
+          <w:sz w:val="19"/>
+        </w:rPr>
+        <w:t>以下依据 INTSIG 官方公开手册（CamCard Android 5.1 / Web v1.0）的文字描述补充。</w:t>
+      </w:r>
+      <w:r>
+        <w:rPr>
+          <w:rFonts w:ascii="Arial" w:hAnsi="Arial" w:eastAsia="PingFang SC"/>
+          <w:b/>
+          <w:sz w:val="19"/>
+        </w:rPr>
+        <w:t>属于二手资料，手册版本早于商店当前 8.65.0，且手册界面图未入库，因此只能证明「行为有无」，不能作为像素级 UI 对比证据。</w:t>
+      </w:r>
+    </w:p>
+    <w:tbl>
+      <w:tblPr>
+        <w:tblStyle w:val="TableGrid"/>
+        <w:tblW w:type="dxa" w:w="10206"/>
+        <w:jc w:val="center"/>
+        <w:tblBorders>
+          <w:top w:val="single" w:sz="4" w:space="0" w:color="808080"/>
+          <w:left w:val="single" w:sz="4" w:space="0" w:color="808080"/>
+          <w:bottom w:val="single" w:sz="4" w:space="0" w:color="808080"/>
+          <w:right w:val="single" w:sz="4" w:space="0" w:color="808080"/>
+          <w:insideH w:val="single" w:sz="4" w:space="0" w:color="808080"/>
+          <w:insideV w:val="single" w:sz="4" w:space="0" w:color="808080"/>
+        </w:tblBorders>
+        <w:tblLayout w:type="fixed"/>
+        <w:tblLayout w:type="fixed"/>
+        <w:tblLook w:firstColumn="1" w:firstRow="1" w:lastColumn="0" w:lastRow="0" w:noHBand="0" w:noVBand="1" w:val="04A0"/>
+      </w:tblPr>
+      <w:tblGrid>
+        <w:gridCol w:w="2409"/>
+        <w:gridCol w:w="2409"/>
+        <w:gridCol w:w="2409"/>
+        <w:gridCol w:w="2409"/>
+      </w:tblGrid>
+      <w:tr>
+        <w:tc>
+          <w:tcPr>
+            <w:tcW w:type="dxa" w:w="1361"/>
+            <w:shd w:val="clear" w:fill="D9E2F3"/>
+          </w:tcPr>
+          <w:p>
+            <w:r>
+              <w:rPr>
+                <w:b/>
+              </w:rPr>
+            </w:r>
+            <w:r>
+              <w:rPr>
+                <w:rFonts w:ascii="Arial" w:hAnsi="Arial" w:eastAsia="PingFang SC"/>
+                <w:b/>
+                <w:sz w:val="19"/>
+              </w:rPr>
+              <w:t>页面</w:t>
+            </w:r>
+          </w:p>
+        </w:tc>
+        <w:tc>
+          <w:tcPr>
+            <w:tcW w:type="dxa" w:w="3628"/>
+            <w:shd w:val="clear" w:fill="D9E2F3"/>
+          </w:tcPr>
+          <w:p>
+            <w:r>
+              <w:rPr>
+                <w:b/>
+              </w:rPr>
+            </w:r>
+            <w:r>
+              <w:rPr>
+                <w:rFonts w:ascii="Arial" w:hAnsi="Arial" w:eastAsia="PingFang SC"/>
+                <w:b/>
+                <w:sz w:val="19"/>
+              </w:rPr>
+              <w:t>参考版官方手册描述</w:t>
+            </w:r>
+          </w:p>
+        </w:tc>
+        <w:tc>
+          <w:tcPr>
+            <w:tcW w:type="dxa" w:w="3288"/>
+            <w:shd w:val="clear" w:fill="D9E2F3"/>
+          </w:tcPr>
+          <w:p>
+            <w:r>
+              <w:rPr>
+                <w:b/>
+              </w:rPr>
+            </w:r>
+            <w:r>
+              <w:rPr>
+                <w:rFonts w:ascii="Arial" w:hAnsi="Arial" w:eastAsia="PingFang SC"/>
+                <w:b/>
+                <w:sz w:val="19"/>
+              </w:rPr>
+              <w:t>本项目</w:t>
+            </w:r>
+          </w:p>
+        </w:tc>
+        <w:tc>
+          <w:tcPr>
+            <w:tcW w:type="dxa" w:w="1928"/>
+            <w:shd w:val="clear" w:fill="D9E2F3"/>
+          </w:tcPr>
+          <w:p>
+            <w:r>
+              <w:rPr>
+                <w:b/>
+              </w:rPr>
+            </w:r>
+            <w:r>
+              <w:rPr>
+                <w:rFonts w:ascii="Arial" w:hAnsi="Arial" w:eastAsia="PingFang SC"/>
+                <w:b/>
+                <w:sz w:val="19"/>
+              </w:rPr>
+              <w:t>判定</w:t>
+            </w:r>
+          </w:p>
+        </w:tc>
+      </w:tr>
+      <w:tr>
+        <w:tc>
+          <w:tcPr>
+            <w:tcW w:type="dxa" w:w="1361"/>
+          </w:tcPr>
+          <w:p>
+            <w:r/>
+            <w:r>
+              <w:rPr>
+                <w:rFonts w:ascii="Arial" w:hAnsi="Arial" w:eastAsia="PingFang SC"/>
+                <w:b w:val="0"/>
+                <w:sz w:val="18"/>
+              </w:rPr>
+              <w:t>名片详情</w:t>
+            </w:r>
+          </w:p>
+        </w:tc>
+        <w:tc>
+          <w:tcPr>
+            <w:tcW w:type="dxa" w:w="3628"/>
+          </w:tcPr>
+          <w:p>
+            <w:r/>
+            <w:r>
+              <w:rPr>
+                <w:rFonts w:ascii="Arial" w:hAnsi="Arial" w:eastAsia="PingFang SC"/>
+                <w:b w:val="0"/>
+                <w:sz w:val="18"/>
+              </w:rPr>
+              <w:t>名片图 + 联系信息；工具条「删除 / 导出 / 编辑」；导出 vCard；快捷菜单拨号 / 邮件 / 短信；备注支持文字、图片、提醒</w:t>
+            </w:r>
+          </w:p>
+        </w:tc>
+        <w:tc>
+          <w:tcPr>
+            <w:tcW w:type="dxa" w:w="3288"/>
+          </w:tcPr>
+          <w:p>
+            <w:r/>
+            <w:r>
+              <w:rPr>
+                <w:rFonts w:ascii="Arial" w:hAnsi="Arial" w:eastAsia="PingFang SC"/>
+                <w:b w:val="0"/>
+                <w:sz w:val="18"/>
+              </w:rPr>
+              <w:t>名片图 + 全部字段；电话 / 邮箱 / 网址 / 地图跳转；编辑 / 删除 / 导出（vCard + 系统通讯录）</w:t>
+            </w:r>
+          </w:p>
+        </w:tc>
+        <w:tc>
+          <w:tcPr>
+            <w:tcW w:type="dxa" w:w="1928"/>
+          </w:tcPr>
+          <w:p>
+            <w:r/>
+            <w:r>
+              <w:rPr>
+                <w:rFonts w:ascii="Arial" w:hAnsi="Arial" w:eastAsia="PingFang SC"/>
+                <w:b w:val="0"/>
+                <w:sz w:val="18"/>
+              </w:rPr>
+              <w:t>范围内一致；短信与备注提醒未实现</w:t>
+            </w:r>
+          </w:p>
+        </w:tc>
+      </w:tr>
+      <w:tr>
+        <w:tc>
+          <w:tcPr>
+            <w:tcW w:type="dxa" w:w="1361"/>
+          </w:tcPr>
+          <w:p>
+            <w:r/>
+            <w:r>
+              <w:rPr>
+                <w:rFonts w:ascii="Arial" w:hAnsi="Arial" w:eastAsia="PingFang SC"/>
+                <w:b w:val="0"/>
+                <w:sz w:val="18"/>
+              </w:rPr>
+              <w:t>识别结果编辑</w:t>
+            </w:r>
+          </w:p>
+        </w:tc>
+        <w:tc>
+          <w:tcPr>
+            <w:tcW w:type="dxa" w:w="3628"/>
+          </w:tcPr>
+          <w:p>
+            <w:r/>
+            <w:r>
+              <w:rPr>
+                <w:rFonts w:ascii="Arial" w:hAnsi="Arial" w:eastAsia="PingFang SC"/>
+                <w:b w:val="0"/>
+                <w:sz w:val="18"/>
+              </w:rPr>
+              <w:t>字段级编辑区；选中某项时上方名片图高亮其位置；姓名不可删；可添加其他项目；可加背面图；可云识别</w:t>
+            </w:r>
+          </w:p>
+        </w:tc>
+        <w:tc>
+          <w:tcPr>
+            <w:tcW w:type="dxa" w:w="3288"/>
+          </w:tcPr>
+          <w:p>
+            <w:r/>
+            <w:r>
+              <w:rPr>
+                <w:rFonts w:ascii="Arial" w:hAnsi="Arial" w:eastAsia="PingFang SC"/>
+                <w:b w:val="0"/>
+                <w:sz w:val="18"/>
+              </w:rPr>
+              <w:t>8 字段全部可改、多电话分流、多 Email、人工修正标记</w:t>
+            </w:r>
+          </w:p>
+        </w:tc>
+        <w:tc>
+          <w:tcPr>
+            <w:tcW w:type="dxa" w:w="1928"/>
+          </w:tcPr>
+          <w:p>
+            <w:r/>
+            <w:r>
+              <w:rPr>
+                <w:rFonts w:ascii="Arial" w:hAnsi="Arial" w:eastAsia="PingFang SC"/>
+                <w:b w:val="0"/>
+                <w:sz w:val="18"/>
+              </w:rPr>
+              <w:t>方向一致；未实现「选中字段 → 原图高亮」</w:t>
+            </w:r>
+          </w:p>
+        </w:tc>
+      </w:tr>
+      <w:tr>
+        <w:tc>
+          <w:tcPr>
+            <w:tcW w:type="dxa" w:w="1361"/>
+          </w:tcPr>
+          <w:p>
+            <w:r/>
+            <w:r>
+              <w:rPr>
+                <w:rFonts w:ascii="Arial" w:hAnsi="Arial" w:eastAsia="PingFang SC"/>
+                <w:b w:val="0"/>
+                <w:sz w:val="18"/>
+              </w:rPr>
+              <w:t>保存</w:t>
+            </w:r>
+          </w:p>
+        </w:tc>
+        <w:tc>
+          <w:tcPr>
+            <w:tcW w:type="dxa" w:w="3628"/>
+          </w:tcPr>
+          <w:p>
+            <w:r/>
+            <w:r>
+              <w:rPr>
+                <w:rFonts w:ascii="Arial" w:hAnsi="Arial" w:eastAsia="PingFang SC"/>
+                <w:b w:val="0"/>
+                <w:sz w:val="18"/>
+              </w:rPr>
+              <w:t>可选分组、保存到通讯录、删除名片、右上角保存</w:t>
+            </w:r>
+          </w:p>
+        </w:tc>
+        <w:tc>
+          <w:tcPr>
+            <w:tcW w:type="dxa" w:w="3288"/>
+          </w:tcPr>
+          <w:p>
+            <w:r/>
+            <w:r>
+              <w:rPr>
+                <w:rFonts w:ascii="Arial" w:hAnsi="Arial" w:eastAsia="PingFang SC"/>
+                <w:b w:val="0"/>
+                <w:sz w:val="18"/>
+              </w:rPr>
+              <w:t>保存到本地名片夹 + 标签；详情页另行导出通讯录 / vCard</w:t>
+            </w:r>
+          </w:p>
+        </w:tc>
+        <w:tc>
+          <w:tcPr>
+            <w:tcW w:type="dxa" w:w="1928"/>
+          </w:tcPr>
+          <w:p>
+            <w:r/>
+            <w:r>
+              <w:rPr>
+                <w:rFonts w:ascii="Arial" w:hAnsi="Arial" w:eastAsia="PingFang SC"/>
+                <w:b w:val="0"/>
+                <w:sz w:val="18"/>
+              </w:rPr>
+              <w:t>能力对等，入口位置不同</w:t>
+            </w:r>
+          </w:p>
+        </w:tc>
+      </w:tr>
+      <w:tr>
+        <w:tc>
+          <w:tcPr>
+            <w:tcW w:type="dxa" w:w="1361"/>
+          </w:tcPr>
+          <w:p>
+            <w:r/>
+            <w:r>
+              <w:rPr>
+                <w:rFonts w:ascii="Arial" w:hAnsi="Arial" w:eastAsia="PingFang SC"/>
+                <w:b w:val="0"/>
+                <w:sz w:val="18"/>
+              </w:rPr>
+              <w:t>搜索</w:t>
+            </w:r>
+          </w:p>
+        </w:tc>
+        <w:tc>
+          <w:tcPr>
+            <w:tcW w:type="dxa" w:w="3628"/>
+          </w:tcPr>
+          <w:p>
+            <w:r/>
+            <w:r>
+              <w:rPr>
+                <w:rFonts w:ascii="Arial" w:hAnsi="Arial" w:eastAsia="PingFang SC"/>
+                <w:b w:val="0"/>
+                <w:sz w:val="18"/>
+              </w:rPr>
+              <w:t>分组内按数字 / 拼音 / 公司名搜索，命中蓝色高亮</w:t>
+            </w:r>
+          </w:p>
+        </w:tc>
+        <w:tc>
+          <w:tcPr>
+            <w:tcW w:type="dxa" w:w="3288"/>
+          </w:tcPr>
+          <w:p>
+            <w:r/>
+            <w:r>
+              <w:rPr>
+                <w:rFonts w:ascii="Arial" w:hAnsi="Arial" w:eastAsia="PingFang SC"/>
+                <w:b w:val="0"/>
+                <w:sz w:val="18"/>
+              </w:rPr>
+              <w:t>独立搜索页，覆盖姓名 / 公司 / 职位 / 电话 / Email，支持标签筛选</w:t>
+            </w:r>
+          </w:p>
+        </w:tc>
+        <w:tc>
+          <w:tcPr>
+            <w:tcW w:type="dxa" w:w="1928"/>
+          </w:tcPr>
+          <w:p>
+            <w:r/>
+            <w:r>
+              <w:rPr>
+                <w:rFonts w:ascii="Arial" w:hAnsi="Arial" w:eastAsia="PingFang SC"/>
+                <w:b w:val="0"/>
+                <w:sz w:val="18"/>
+              </w:rPr>
+              <w:t>范围更宽；未实现关键词高亮</w:t>
+            </w:r>
+          </w:p>
+        </w:tc>
+      </w:tr>
+      <w:tr>
+        <w:tc>
+          <w:tcPr>
+            <w:tcW w:type="dxa" w:w="1361"/>
+          </w:tcPr>
+          <w:p>
+            <w:r/>
+            <w:r>
+              <w:rPr>
+                <w:rFonts w:ascii="Arial" w:hAnsi="Arial" w:eastAsia="PingFang SC"/>
+                <w:b w:val="0"/>
+                <w:sz w:val="18"/>
+              </w:rPr>
+              <w:t>标签 / 分组</w:t>
+            </w:r>
+          </w:p>
+        </w:tc>
+        <w:tc>
+          <w:tcPr>
+            <w:tcW w:type="dxa" w:w="3628"/>
+          </w:tcPr>
+          <w:p>
+            <w:r/>
+            <w:r>
+              <w:rPr>
+                <w:rFonts w:ascii="Arial" w:hAnsi="Arial" w:eastAsia="PingFang SC"/>
+                <w:b w:val="0"/>
+                <w:sz w:val="18"/>
+              </w:rPr>
+              <w:t>分组管理：新增、改名、删除；名片可归组</w:t>
+            </w:r>
+          </w:p>
+        </w:tc>
+        <w:tc>
+          <w:tcPr>
+            <w:tcW w:type="dxa" w:w="3288"/>
+          </w:tcPr>
+          <w:p>
+            <w:r/>
+            <w:r>
+              <w:rPr>
+                <w:rFonts w:ascii="Arial" w:hAnsi="Arial" w:eastAsia="PingFang SC"/>
+                <w:b w:val="0"/>
+                <w:sz w:val="18"/>
+              </w:rPr>
+              <w:t>标签管理：新增 / 删除 / 按标签筛选</w:t>
+            </w:r>
+          </w:p>
+        </w:tc>
+        <w:tc>
+          <w:tcPr>
+            <w:tcW w:type="dxa" w:w="1928"/>
+          </w:tcPr>
+          <w:p>
+            <w:r/>
+            <w:r>
+              <w:rPr>
+                <w:rFonts w:ascii="Arial" w:hAnsi="Arial" w:eastAsia="PingFang SC"/>
+                <w:b w:val="0"/>
+                <w:sz w:val="18"/>
+              </w:rPr>
+              <w:t>能力对等，模型不同（扁平标签 vs 分组）</w:t>
+            </w:r>
+          </w:p>
+        </w:tc>
+      </w:tr>
+    </w:tbl>
     <w:p>
       <w:pPr>
         <w:jc w:val="right"/>

</xml_diff>

<commit_message>
docs: add reference screenshots for boundary, detail, search, OCR and edit
Collected official CamCard product-page images and App Store shots so the
UI comparison now covers correction, detail, search and edit with real
reference images. CamCard publishes no recognition-result screenshot, so
the CamScanner recording frame is used there and labelled as such.
</commit_message>
<xml_diff>
--- a/UI截图对比报告.docx
+++ b/UI截图对比报告.docx
@@ -2714,7 +2714,7 @@
           <w:b w:val="0"/>
           <w:sz w:val="20"/>
         </w:rPr>
-        <w:t>详情页、OCR 原始文本页、字段校正页、编辑页：官方商店截图未展示；其中详情页、识别结果编辑与搜索已用 INTSIG 官方手册做文字补充（见第 7 节），仍无参考截图。</w:t>
+        <w:t>详情页、OCR 原始文本页、字段校正页、编辑页：官方商店截图未展示；其中详情页、搜索与编辑已补充官方公开参考图（见第 8 节），识别结果页用 CamScanner 一手录屏帧代替；字段级编辑表单仍无公开截图。</w:t>
       </w:r>
     </w:p>
     <w:p>
@@ -3511,6 +3511,1714 @@
         <w:t>BlackBox 项目组 · 2026-10-28</w:t>
       </w:r>
     </w:p>
+    <w:p>
+      <w:r>
+        <w:br w:type="page"/>
+      </w:r>
+    </w:p>
+    <w:p>
+      <w:pPr>
+        <w:pStyle w:val="Heading1"/>
+      </w:pPr>
+      <w:r>
+        <w:t>8  补充对照：校正 / 详情 / 搜索 / OCR / 编辑（含参考图）</w:t>
+      </w:r>
+    </w:p>
+    <w:p>
+      <w:r>
+        <w:t>2026-10-28 新增。参考图来自 CamCard 官网产品页（camcard.com/zh-cn）与 App Store 中国区/美区公开截图；本项目图为 Tests/AcceptanceEvidence 的验收截图。参考素材仍是营销图、且非教师锁定版本，因此只做「同页面、关键控件与路径」级别的对照，不做像素级 diff。</w:t>
+      </w:r>
+    </w:p>
+    <w:p>
+      <w:pPr>
+        <w:pStyle w:val="Heading2"/>
+      </w:pPr>
+      <w:r>
+        <w:t>8.1  边界检测与校正</w:t>
+      </w:r>
+    </w:p>
+    <w:p>
+      <w:r>
+        <w:rPr>
+          <w:sz w:val="20"/>
+        </w:rPr>
+        <w:t>参考：拍摄中实时框选（青色框，可同时框多张）。本项目：拍摄后自动检测，绿色多边形，手动调整时橙色、四角可拖；底部「重拍 / 确认校正 →」。</w:t>
+      </w:r>
+    </w:p>
+    <w:tbl>
+      <w:tblPr>
+        <w:tblW w:type="auto" w:w="0"/>
+        <w:jc w:val="center"/>
+        <w:tblLook w:firstColumn="1" w:firstRow="1" w:lastColumn="0" w:lastRow="0" w:noHBand="0" w:noVBand="1" w:val="04A0"/>
+        <w:tblLayout w:type="fixed"/>
+        <w:tblW w:w="9525" w:type="dxa"/>
+      </w:tblPr>
+      <w:tblGrid>
+        <w:gridCol w:w="4819"/>
+        <w:gridCol w:w="4819"/>
+      </w:tblGrid>
+      <w:tr>
+        <w:tc>
+          <w:tcPr>
+            <w:tcW w:type="dxa" w:w="4762"/>
+            <w:shd w:val="clear" w:fill="F2F2F2"/>
+            <w:tcBorders>
+              <w:top w:val="single" w:sz="6" w:space="0" w:color="BFBFBF"/>
+              <w:left w:val="single" w:sz="6" w:space="0" w:color="BFBFBF"/>
+              <w:bottom w:val="single" w:sz="6" w:space="0" w:color="BFBFBF"/>
+              <w:right w:val="single" w:sz="6" w:space="0" w:color="BFBFBF"/>
+            </w:tcBorders>
+          </w:tcPr>
+          <w:p>
+            <w:pPr>
+              <w:jc w:val="center"/>
+            </w:pPr>
+            <w:r/>
+            <w:r>
+              <w:rPr>
+                <w:b/>
+                <w:sz w:val="18"/>
+              </w:rPr>
+              <w:t>参考版（CamCard 公开素材）</w:t>
+            </w:r>
+          </w:p>
+        </w:tc>
+        <w:tc>
+          <w:tcPr>
+            <w:tcW w:type="dxa" w:w="4762"/>
+            <w:shd w:val="clear" w:fill="F2F2F2"/>
+            <w:tcBorders>
+              <w:top w:val="single" w:sz="6" w:space="0" w:color="BFBFBF"/>
+              <w:left w:val="single" w:sz="6" w:space="0" w:color="BFBFBF"/>
+              <w:bottom w:val="single" w:sz="6" w:space="0" w:color="BFBFBF"/>
+              <w:right w:val="single" w:sz="6" w:space="0" w:color="BFBFBF"/>
+            </w:tcBorders>
+          </w:tcPr>
+          <w:p>
+            <w:pPr>
+              <w:jc w:val="center"/>
+            </w:pPr>
+            <w:r/>
+            <w:r>
+              <w:rPr>
+                <w:b/>
+                <w:sz w:val="18"/>
+              </w:rPr>
+              <w:t>本项目（BlackBox）</w:t>
+            </w:r>
+          </w:p>
+        </w:tc>
+      </w:tr>
+      <w:tr>
+        <w:tc>
+          <w:tcPr>
+            <w:tcW w:type="dxa" w:w="4762"/>
+            <w:tcBorders>
+              <w:top w:val="single" w:sz="6" w:space="0" w:color="BFBFBF"/>
+              <w:left w:val="single" w:sz="6" w:space="0" w:color="BFBFBF"/>
+              <w:bottom w:val="single" w:sz="6" w:space="0" w:color="BFBFBF"/>
+              <w:right w:val="single" w:sz="6" w:space="0" w:color="BFBFBF"/>
+            </w:tcBorders>
+          </w:tcPr>
+          <w:p>
+            <w:pPr>
+              <w:jc w:val="center"/>
+            </w:pPr>
+            <w:r>
+              <w:drawing>
+                <wp:inline xmlns:a="http://schemas.openxmlformats.org/drawingml/2006/main" xmlns:pic="http://schemas.openxmlformats.org/drawingml/2006/picture">
+                  <wp:extent cx="1925288" cy="3420000"/>
+                  <wp:docPr id="5" name="Picture 5"/>
+                  <wp:cNvGraphicFramePr>
+                    <a:graphicFrameLocks noChangeAspect="1"/>
+                  </wp:cNvGraphicFramePr>
+                  <a:graphic>
+                    <a:graphicData uri="http://schemas.openxmlformats.org/drawingml/2006/picture">
+                      <pic:pic>
+                        <pic:nvPicPr>
+                          <pic:cNvPr id="0" name="camcard_store_boundary.png"/>
+                          <pic:cNvPicPr/>
+                        </pic:nvPicPr>
+                        <pic:blipFill>
+                          <a:blip r:embed="rId13"/>
+                          <a:stretch>
+                            <a:fillRect/>
+                          </a:stretch>
+                        </pic:blipFill>
+                        <pic:spPr>
+                          <a:xfrm>
+                            <a:off x="0" y="0"/>
+                            <a:ext cx="1925288" cy="3420000"/>
+                          </a:xfrm>
+                          <a:prstGeom prst="rect"/>
+                        </pic:spPr>
+                      </pic:pic>
+                    </a:graphicData>
+                  </a:graphic>
+                </wp:inline>
+              </w:drawing>
+            </w:r>
+          </w:p>
+        </w:tc>
+        <w:tc>
+          <w:tcPr>
+            <w:tcW w:type="dxa" w:w="4762"/>
+            <w:tcBorders>
+              <w:top w:val="single" w:sz="6" w:space="0" w:color="BFBFBF"/>
+              <w:left w:val="single" w:sz="6" w:space="0" w:color="BFBFBF"/>
+              <w:bottom w:val="single" w:sz="6" w:space="0" w:color="BFBFBF"/>
+              <w:right w:val="single" w:sz="6" w:space="0" w:color="BFBFBF"/>
+            </w:tcBorders>
+          </w:tcPr>
+          <w:p>
+            <w:pPr>
+              <w:jc w:val="center"/>
+            </w:pPr>
+            <w:r>
+              <w:drawing>
+                <wp:inline xmlns:a="http://schemas.openxmlformats.org/drawingml/2006/main" xmlns:pic="http://schemas.openxmlformats.org/drawingml/2006/picture">
+                  <wp:extent cx="1573044" cy="3420000"/>
+                  <wp:docPr id="6" name="Picture 6"/>
+                  <wp:cNvGraphicFramePr>
+                    <a:graphicFrameLocks noChangeAspect="1"/>
+                  </wp:cNvGraphicFramePr>
+                  <a:graphic>
+                    <a:graphicData uri="http://schemas.openxmlformats.org/drawingml/2006/picture">
+                      <pic:pic>
+                        <pic:nvPicPr>
+                          <pic:cNvPr id="0" name="03_T06_boundary.png"/>
+                          <pic:cNvPicPr/>
+                        </pic:nvPicPr>
+                        <pic:blipFill>
+                          <a:blip r:embed="rId14"/>
+                          <a:stretch>
+                            <a:fillRect/>
+                          </a:stretch>
+                        </pic:blipFill>
+                        <pic:spPr>
+                          <a:xfrm>
+                            <a:off x="0" y="0"/>
+                            <a:ext cx="1573044" cy="3420000"/>
+                          </a:xfrm>
+                          <a:prstGeom prst="rect"/>
+                        </pic:spPr>
+                      </pic:pic>
+                    </a:graphicData>
+                  </a:graphic>
+                </wp:inline>
+              </w:drawing>
+            </w:r>
+          </w:p>
+        </w:tc>
+      </w:tr>
+      <w:tr>
+        <w:tc>
+          <w:tcPr>
+            <w:tcW w:type="dxa" w:w="4762"/>
+            <w:tcBorders>
+              <w:top w:val="single" w:sz="6" w:space="0" w:color="BFBFBF"/>
+              <w:left w:val="single" w:sz="6" w:space="0" w:color="BFBFBF"/>
+              <w:bottom w:val="single" w:sz="6" w:space="0" w:color="BFBFBF"/>
+              <w:right w:val="single" w:sz="6" w:space="0" w:color="BFBFBF"/>
+            </w:tcBorders>
+          </w:tcPr>
+          <w:p>
+            <w:pPr>
+              <w:jc w:val="center"/>
+            </w:pPr>
+            <w:r>
+              <w:rPr>
+                <w:color w:val="595959"/>
+                <w:sz w:val="18"/>
+              </w:rPr>
+              <w:t>参考版：拍摄页实时框选（App Store 美区）</w:t>
+            </w:r>
+          </w:p>
+        </w:tc>
+        <w:tc>
+          <w:tcPr>
+            <w:tcW w:type="dxa" w:w="4762"/>
+            <w:tcBorders>
+              <w:top w:val="single" w:sz="6" w:space="0" w:color="BFBFBF"/>
+              <w:left w:val="single" w:sz="6" w:space="0" w:color="BFBFBF"/>
+              <w:bottom w:val="single" w:sz="6" w:space="0" w:color="BFBFBF"/>
+              <w:right w:val="single" w:sz="6" w:space="0" w:color="BFBFBF"/>
+            </w:tcBorders>
+          </w:tcPr>
+          <w:p>
+            <w:pPr>
+              <w:jc w:val="center"/>
+            </w:pPr>
+            <w:r>
+              <w:rPr>
+                <w:color w:val="595959"/>
+                <w:sz w:val="18"/>
+              </w:rPr>
+              <w:t>本项目：03_T06_boundary.png</w:t>
+            </w:r>
+          </w:p>
+        </w:tc>
+      </w:tr>
+    </w:tbl>
+    <w:p/>
+    <w:p>
+      <w:pPr>
+        <w:pStyle w:val="Heading2"/>
+      </w:pPr>
+      <w:r>
+        <w:t>8.2  名片详情</w:t>
+      </w:r>
+    </w:p>
+    <w:p>
+      <w:r>
+        <w:rPr>
+          <w:sz w:val="20"/>
+        </w:rPr>
+        <w:t>参考：姓名/职位/公司 + 电话/邮箱/地址 + 编辑名片 / 更换样式。本项目：姓名/公司/职位/部门 + 联系方式/标签/图片/备注分组，导航栏编辑 / 导出 / 删除。</w:t>
+      </w:r>
+    </w:p>
+    <w:tbl>
+      <w:tblPr>
+        <w:tblW w:type="auto" w:w="0"/>
+        <w:jc w:val="center"/>
+        <w:tblLook w:firstColumn="1" w:firstRow="1" w:lastColumn="0" w:lastRow="0" w:noHBand="0" w:noVBand="1" w:val="04A0"/>
+        <w:tblLayout w:type="fixed"/>
+        <w:tblW w:w="9525" w:type="dxa"/>
+      </w:tblPr>
+      <w:tblGrid>
+        <w:gridCol w:w="4819"/>
+        <w:gridCol w:w="4819"/>
+      </w:tblGrid>
+      <w:tr>
+        <w:tc>
+          <w:tcPr>
+            <w:tcW w:type="dxa" w:w="4762"/>
+            <w:shd w:val="clear" w:fill="F2F2F2"/>
+            <w:tcBorders>
+              <w:top w:val="single" w:sz="6" w:space="0" w:color="BFBFBF"/>
+              <w:left w:val="single" w:sz="6" w:space="0" w:color="BFBFBF"/>
+              <w:bottom w:val="single" w:sz="6" w:space="0" w:color="BFBFBF"/>
+              <w:right w:val="single" w:sz="6" w:space="0" w:color="BFBFBF"/>
+            </w:tcBorders>
+          </w:tcPr>
+          <w:p>
+            <w:pPr>
+              <w:jc w:val="center"/>
+            </w:pPr>
+            <w:r/>
+            <w:r>
+              <w:rPr>
+                <w:b/>
+                <w:sz w:val="18"/>
+              </w:rPr>
+              <w:t>参考版（CamCard 公开素材）</w:t>
+            </w:r>
+          </w:p>
+        </w:tc>
+        <w:tc>
+          <w:tcPr>
+            <w:tcW w:type="dxa" w:w="4762"/>
+            <w:shd w:val="clear" w:fill="F2F2F2"/>
+            <w:tcBorders>
+              <w:top w:val="single" w:sz="6" w:space="0" w:color="BFBFBF"/>
+              <w:left w:val="single" w:sz="6" w:space="0" w:color="BFBFBF"/>
+              <w:bottom w:val="single" w:sz="6" w:space="0" w:color="BFBFBF"/>
+              <w:right w:val="single" w:sz="6" w:space="0" w:color="BFBFBF"/>
+            </w:tcBorders>
+          </w:tcPr>
+          <w:p>
+            <w:pPr>
+              <w:jc w:val="center"/>
+            </w:pPr>
+            <w:r/>
+            <w:r>
+              <w:rPr>
+                <w:b/>
+                <w:sz w:val="18"/>
+              </w:rPr>
+              <w:t>本项目（BlackBox）</w:t>
+            </w:r>
+          </w:p>
+        </w:tc>
+      </w:tr>
+      <w:tr>
+        <w:tc>
+          <w:tcPr>
+            <w:tcW w:type="dxa" w:w="4762"/>
+            <w:tcBorders>
+              <w:top w:val="single" w:sz="6" w:space="0" w:color="BFBFBF"/>
+              <w:left w:val="single" w:sz="6" w:space="0" w:color="BFBFBF"/>
+              <w:bottom w:val="single" w:sz="6" w:space="0" w:color="BFBFBF"/>
+              <w:right w:val="single" w:sz="6" w:space="0" w:color="BFBFBF"/>
+            </w:tcBorders>
+          </w:tcPr>
+          <w:p>
+            <w:pPr>
+              <w:jc w:val="center"/>
+            </w:pPr>
+            <w:r>
+              <w:drawing>
+                <wp:inline xmlns:a="http://schemas.openxmlformats.org/drawingml/2006/main" xmlns:pic="http://schemas.openxmlformats.org/drawingml/2006/picture">
+                  <wp:extent cx="2795850" cy="3420000"/>
+                  <wp:docPr id="7" name="Picture 7"/>
+                  <wp:cNvGraphicFramePr>
+                    <a:graphicFrameLocks noChangeAspect="1"/>
+                  </wp:cNvGraphicFramePr>
+                  <a:graphic>
+                    <a:graphicData uri="http://schemas.openxmlformats.org/drawingml/2006/picture">
+                      <pic:pic>
+                        <pic:nvPicPr>
+                          <pic:cNvPr id="0" name="camcard_site_detail.png"/>
+                          <pic:cNvPicPr/>
+                        </pic:nvPicPr>
+                        <pic:blipFill>
+                          <a:blip r:embed="rId15"/>
+                          <a:stretch>
+                            <a:fillRect/>
+                          </a:stretch>
+                        </pic:blipFill>
+                        <pic:spPr>
+                          <a:xfrm>
+                            <a:off x="0" y="0"/>
+                            <a:ext cx="2795850" cy="3420000"/>
+                          </a:xfrm>
+                          <a:prstGeom prst="rect"/>
+                        </pic:spPr>
+                      </pic:pic>
+                    </a:graphicData>
+                  </a:graphic>
+                </wp:inline>
+              </w:drawing>
+            </w:r>
+          </w:p>
+        </w:tc>
+        <w:tc>
+          <w:tcPr>
+            <w:tcW w:type="dxa" w:w="4762"/>
+            <w:tcBorders>
+              <w:top w:val="single" w:sz="6" w:space="0" w:color="BFBFBF"/>
+              <w:left w:val="single" w:sz="6" w:space="0" w:color="BFBFBF"/>
+              <w:bottom w:val="single" w:sz="6" w:space="0" w:color="BFBFBF"/>
+              <w:right w:val="single" w:sz="6" w:space="0" w:color="BFBFBF"/>
+            </w:tcBorders>
+          </w:tcPr>
+          <w:p>
+            <w:pPr>
+              <w:jc w:val="center"/>
+            </w:pPr>
+            <w:r>
+              <w:drawing>
+                <wp:inline xmlns:a="http://schemas.openxmlformats.org/drawingml/2006/main" xmlns:pic="http://schemas.openxmlformats.org/drawingml/2006/picture">
+                  <wp:extent cx="1573044" cy="3420000"/>
+                  <wp:docPr id="8" name="Picture 8"/>
+                  <wp:cNvGraphicFramePr>
+                    <a:graphicFrameLocks noChangeAspect="1"/>
+                  </wp:cNvGraphicFramePr>
+                  <a:graphic>
+                    <a:graphicData uri="http://schemas.openxmlformats.org/drawingml/2006/picture">
+                      <pic:pic>
+                        <pic:nvPicPr>
+                          <pic:cNvPr id="0" name="09_T13_detail.png"/>
+                          <pic:cNvPicPr/>
+                        </pic:nvPicPr>
+                        <pic:blipFill>
+                          <a:blip r:embed="rId16"/>
+                          <a:stretch>
+                            <a:fillRect/>
+                          </a:stretch>
+                        </pic:blipFill>
+                        <pic:spPr>
+                          <a:xfrm>
+                            <a:off x="0" y="0"/>
+                            <a:ext cx="1573044" cy="3420000"/>
+                          </a:xfrm>
+                          <a:prstGeom prst="rect"/>
+                        </pic:spPr>
+                      </pic:pic>
+                    </a:graphicData>
+                  </a:graphic>
+                </wp:inline>
+              </w:drawing>
+            </w:r>
+          </w:p>
+        </w:tc>
+      </w:tr>
+      <w:tr>
+        <w:tc>
+          <w:tcPr>
+            <w:tcW w:type="dxa" w:w="4762"/>
+            <w:tcBorders>
+              <w:top w:val="single" w:sz="6" w:space="0" w:color="BFBFBF"/>
+              <w:left w:val="single" w:sz="6" w:space="0" w:color="BFBFBF"/>
+              <w:bottom w:val="single" w:sz="6" w:space="0" w:color="BFBFBF"/>
+              <w:right w:val="single" w:sz="6" w:space="0" w:color="BFBFBF"/>
+            </w:tcBorders>
+          </w:tcPr>
+          <w:p>
+            <w:pPr>
+              <w:jc w:val="center"/>
+            </w:pPr>
+            <w:r>
+              <w:rPr>
+                <w:color w:val="595959"/>
+                <w:sz w:val="18"/>
+              </w:rPr>
+              <w:t>参考版：数字名片详情（官网产品页）</w:t>
+            </w:r>
+          </w:p>
+        </w:tc>
+        <w:tc>
+          <w:tcPr>
+            <w:tcW w:type="dxa" w:w="4762"/>
+            <w:tcBorders>
+              <w:top w:val="single" w:sz="6" w:space="0" w:color="BFBFBF"/>
+              <w:left w:val="single" w:sz="6" w:space="0" w:color="BFBFBF"/>
+              <w:bottom w:val="single" w:sz="6" w:space="0" w:color="BFBFBF"/>
+              <w:right w:val="single" w:sz="6" w:space="0" w:color="BFBFBF"/>
+            </w:tcBorders>
+          </w:tcPr>
+          <w:p>
+            <w:pPr>
+              <w:jc w:val="center"/>
+            </w:pPr>
+            <w:r>
+              <w:rPr>
+                <w:color w:val="595959"/>
+                <w:sz w:val="18"/>
+              </w:rPr>
+              <w:t>本项目：09_T13_detail.png</w:t>
+            </w:r>
+          </w:p>
+        </w:tc>
+      </w:tr>
+    </w:tbl>
+    <w:p/>
+    <w:p>
+      <w:pPr>
+        <w:pStyle w:val="Heading2"/>
+      </w:pPr>
+      <w:r>
+        <w:t>8.3  搜索</w:t>
+      </w:r>
+    </w:p>
+    <w:p>
+      <w:r>
+        <w:rPr>
+          <w:sz w:val="20"/>
+        </w:rPr>
+        <w:t>参考：顶部搜索框 + 结果卡片列表（人脉搜索）。本项目：搜索框 + 名片行（首字头像、姓名、公司），三态齐全，匹配姓名/公司/职位/手机/Email。</w:t>
+      </w:r>
+    </w:p>
+    <w:tbl>
+      <w:tblPr>
+        <w:tblW w:type="auto" w:w="0"/>
+        <w:jc w:val="center"/>
+        <w:tblLook w:firstColumn="1" w:firstRow="1" w:lastColumn="0" w:lastRow="0" w:noHBand="0" w:noVBand="1" w:val="04A0"/>
+        <w:tblLayout w:type="fixed"/>
+        <w:tblW w:w="9525" w:type="dxa"/>
+      </w:tblPr>
+      <w:tblGrid>
+        <w:gridCol w:w="4819"/>
+        <w:gridCol w:w="4819"/>
+      </w:tblGrid>
+      <w:tr>
+        <w:tc>
+          <w:tcPr>
+            <w:tcW w:type="dxa" w:w="4762"/>
+            <w:shd w:val="clear" w:fill="F2F2F2"/>
+            <w:tcBorders>
+              <w:top w:val="single" w:sz="6" w:space="0" w:color="BFBFBF"/>
+              <w:left w:val="single" w:sz="6" w:space="0" w:color="BFBFBF"/>
+              <w:bottom w:val="single" w:sz="6" w:space="0" w:color="BFBFBF"/>
+              <w:right w:val="single" w:sz="6" w:space="0" w:color="BFBFBF"/>
+            </w:tcBorders>
+          </w:tcPr>
+          <w:p>
+            <w:pPr>
+              <w:jc w:val="center"/>
+            </w:pPr>
+            <w:r/>
+            <w:r>
+              <w:rPr>
+                <w:b/>
+                <w:sz w:val="18"/>
+              </w:rPr>
+              <w:t>参考版（CamCard 公开素材）</w:t>
+            </w:r>
+          </w:p>
+        </w:tc>
+        <w:tc>
+          <w:tcPr>
+            <w:tcW w:type="dxa" w:w="4762"/>
+            <w:shd w:val="clear" w:fill="F2F2F2"/>
+            <w:tcBorders>
+              <w:top w:val="single" w:sz="6" w:space="0" w:color="BFBFBF"/>
+              <w:left w:val="single" w:sz="6" w:space="0" w:color="BFBFBF"/>
+              <w:bottom w:val="single" w:sz="6" w:space="0" w:color="BFBFBF"/>
+              <w:right w:val="single" w:sz="6" w:space="0" w:color="BFBFBF"/>
+            </w:tcBorders>
+          </w:tcPr>
+          <w:p>
+            <w:pPr>
+              <w:jc w:val="center"/>
+            </w:pPr>
+            <w:r/>
+            <w:r>
+              <w:rPr>
+                <w:b/>
+                <w:sz w:val="18"/>
+              </w:rPr>
+              <w:t>本项目（BlackBox）</w:t>
+            </w:r>
+          </w:p>
+        </w:tc>
+      </w:tr>
+      <w:tr>
+        <w:tc>
+          <w:tcPr>
+            <w:tcW w:type="dxa" w:w="4762"/>
+            <w:tcBorders>
+              <w:top w:val="single" w:sz="6" w:space="0" w:color="BFBFBF"/>
+              <w:left w:val="single" w:sz="6" w:space="0" w:color="BFBFBF"/>
+              <w:bottom w:val="single" w:sz="6" w:space="0" w:color="BFBFBF"/>
+              <w:right w:val="single" w:sz="6" w:space="0" w:color="BFBFBF"/>
+            </w:tcBorders>
+          </w:tcPr>
+          <w:p>
+            <w:pPr>
+              <w:jc w:val="center"/>
+            </w:pPr>
+            <w:r>
+              <w:drawing>
+                <wp:inline xmlns:a="http://schemas.openxmlformats.org/drawingml/2006/main" xmlns:pic="http://schemas.openxmlformats.org/drawingml/2006/picture">
+                  <wp:extent cx="1925288" cy="3420000"/>
+                  <wp:docPr id="9" name="Picture 9"/>
+                  <wp:cNvGraphicFramePr>
+                    <a:graphicFrameLocks noChangeAspect="1"/>
+                  </wp:cNvGraphicFramePr>
+                  <a:graphic>
+                    <a:graphicData uri="http://schemas.openxmlformats.org/drawingml/2006/picture">
+                      <pic:pic>
+                        <pic:nvPicPr>
+                          <pic:cNvPr id="0" name="camcard_store_search.png"/>
+                          <pic:cNvPicPr/>
+                        </pic:nvPicPr>
+                        <pic:blipFill>
+                          <a:blip r:embed="rId17"/>
+                          <a:stretch>
+                            <a:fillRect/>
+                          </a:stretch>
+                        </pic:blipFill>
+                        <pic:spPr>
+                          <a:xfrm>
+                            <a:off x="0" y="0"/>
+                            <a:ext cx="1925288" cy="3420000"/>
+                          </a:xfrm>
+                          <a:prstGeom prst="rect"/>
+                        </pic:spPr>
+                      </pic:pic>
+                    </a:graphicData>
+                  </a:graphic>
+                </wp:inline>
+              </w:drawing>
+            </w:r>
+          </w:p>
+        </w:tc>
+        <w:tc>
+          <w:tcPr>
+            <w:tcW w:type="dxa" w:w="4762"/>
+            <w:tcBorders>
+              <w:top w:val="single" w:sz="6" w:space="0" w:color="BFBFBF"/>
+              <w:left w:val="single" w:sz="6" w:space="0" w:color="BFBFBF"/>
+              <w:bottom w:val="single" w:sz="6" w:space="0" w:color="BFBFBF"/>
+              <w:right w:val="single" w:sz="6" w:space="0" w:color="BFBFBF"/>
+            </w:tcBorders>
+          </w:tcPr>
+          <w:p>
+            <w:pPr>
+              <w:jc w:val="center"/>
+            </w:pPr>
+            <w:r>
+              <w:drawing>
+                <wp:inline xmlns:a="http://schemas.openxmlformats.org/drawingml/2006/main" xmlns:pic="http://schemas.openxmlformats.org/drawingml/2006/picture">
+                  <wp:extent cx="1573044" cy="3420000"/>
+                  <wp:docPr id="10" name="Picture 10"/>
+                  <wp:cNvGraphicFramePr>
+                    <a:graphicFrameLocks noChangeAspect="1"/>
+                  </wp:cNvGraphicFramePr>
+                  <a:graphic>
+                    <a:graphicData uri="http://schemas.openxmlformats.org/drawingml/2006/picture">
+                      <pic:pic>
+                        <pic:nvPicPr>
+                          <pic:cNvPr id="0" name="11_T15_search.png"/>
+                          <pic:cNvPicPr/>
+                        </pic:nvPicPr>
+                        <pic:blipFill>
+                          <a:blip r:embed="rId18"/>
+                          <a:stretch>
+                            <a:fillRect/>
+                          </a:stretch>
+                        </pic:blipFill>
+                        <pic:spPr>
+                          <a:xfrm>
+                            <a:off x="0" y="0"/>
+                            <a:ext cx="1573044" cy="3420000"/>
+                          </a:xfrm>
+                          <a:prstGeom prst="rect"/>
+                        </pic:spPr>
+                      </pic:pic>
+                    </a:graphicData>
+                  </a:graphic>
+                </wp:inline>
+              </w:drawing>
+            </w:r>
+          </w:p>
+        </w:tc>
+      </w:tr>
+      <w:tr>
+        <w:tc>
+          <w:tcPr>
+            <w:tcW w:type="dxa" w:w="4762"/>
+            <w:tcBorders>
+              <w:top w:val="single" w:sz="6" w:space="0" w:color="BFBFBF"/>
+              <w:left w:val="single" w:sz="6" w:space="0" w:color="BFBFBF"/>
+              <w:bottom w:val="single" w:sz="6" w:space="0" w:color="BFBFBF"/>
+              <w:right w:val="single" w:sz="6" w:space="0" w:color="BFBFBF"/>
+            </w:tcBorders>
+          </w:tcPr>
+          <w:p>
+            <w:pPr>
+              <w:jc w:val="center"/>
+            </w:pPr>
+            <w:r>
+              <w:rPr>
+                <w:color w:val="595959"/>
+                <w:sz w:val="18"/>
+              </w:rPr>
+              <w:t>参考版：人脉搜索（App Store 中国区）</w:t>
+            </w:r>
+          </w:p>
+        </w:tc>
+        <w:tc>
+          <w:tcPr>
+            <w:tcW w:type="dxa" w:w="4762"/>
+            <w:tcBorders>
+              <w:top w:val="single" w:sz="6" w:space="0" w:color="BFBFBF"/>
+              <w:left w:val="single" w:sz="6" w:space="0" w:color="BFBFBF"/>
+              <w:bottom w:val="single" w:sz="6" w:space="0" w:color="BFBFBF"/>
+              <w:right w:val="single" w:sz="6" w:space="0" w:color="BFBFBF"/>
+            </w:tcBorders>
+          </w:tcPr>
+          <w:p>
+            <w:pPr>
+              <w:jc w:val="center"/>
+            </w:pPr>
+            <w:r>
+              <w:rPr>
+                <w:color w:val="595959"/>
+                <w:sz w:val="18"/>
+              </w:rPr>
+              <w:t>本项目：11_T15_search.png</w:t>
+            </w:r>
+          </w:p>
+        </w:tc>
+      </w:tr>
+    </w:tbl>
+    <w:p/>
+    <w:p>
+      <w:pPr>
+        <w:pStyle w:val="Heading2"/>
+      </w:pPr>
+      <w:r>
+        <w:t>8.4  识别结果（OCR）</w:t>
+      </w:r>
+    </w:p>
+    <w:p>
+      <w:r>
+        <w:rPr>
+          <w:sz w:val="20"/>
+        </w:rPr>
+        <w:t>CamCard 无公开的识别结果页界面图，改用教师批准的 CamScanner 一手录屏帧对照。本项目为独立「OCR 原始文本」页，原文只读，进入字段校正。</w:t>
+      </w:r>
+    </w:p>
+    <w:tbl>
+      <w:tblPr>
+        <w:tblW w:type="auto" w:w="0"/>
+        <w:jc w:val="center"/>
+        <w:tblLook w:firstColumn="1" w:firstRow="1" w:lastColumn="0" w:lastRow="0" w:noHBand="0" w:noVBand="1" w:val="04A0"/>
+        <w:tblLayout w:type="fixed"/>
+        <w:tblW w:w="9525" w:type="dxa"/>
+      </w:tblPr>
+      <w:tblGrid>
+        <w:gridCol w:w="4819"/>
+        <w:gridCol w:w="4819"/>
+      </w:tblGrid>
+      <w:tr>
+        <w:tc>
+          <w:tcPr>
+            <w:tcW w:type="dxa" w:w="4762"/>
+            <w:shd w:val="clear" w:fill="F2F2F2"/>
+            <w:tcBorders>
+              <w:top w:val="single" w:sz="6" w:space="0" w:color="BFBFBF"/>
+              <w:left w:val="single" w:sz="6" w:space="0" w:color="BFBFBF"/>
+              <w:bottom w:val="single" w:sz="6" w:space="0" w:color="BFBFBF"/>
+              <w:right w:val="single" w:sz="6" w:space="0" w:color="BFBFBF"/>
+            </w:tcBorders>
+          </w:tcPr>
+          <w:p>
+            <w:pPr>
+              <w:jc w:val="center"/>
+            </w:pPr>
+            <w:r/>
+            <w:r>
+              <w:rPr>
+                <w:b/>
+                <w:sz w:val="18"/>
+              </w:rPr>
+              <w:t>参考版（CamCard 公开素材）</w:t>
+            </w:r>
+          </w:p>
+        </w:tc>
+        <w:tc>
+          <w:tcPr>
+            <w:tcW w:type="dxa" w:w="4762"/>
+            <w:shd w:val="clear" w:fill="F2F2F2"/>
+            <w:tcBorders>
+              <w:top w:val="single" w:sz="6" w:space="0" w:color="BFBFBF"/>
+              <w:left w:val="single" w:sz="6" w:space="0" w:color="BFBFBF"/>
+              <w:bottom w:val="single" w:sz="6" w:space="0" w:color="BFBFBF"/>
+              <w:right w:val="single" w:sz="6" w:space="0" w:color="BFBFBF"/>
+            </w:tcBorders>
+          </w:tcPr>
+          <w:p>
+            <w:pPr>
+              <w:jc w:val="center"/>
+            </w:pPr>
+            <w:r/>
+            <w:r>
+              <w:rPr>
+                <w:b/>
+                <w:sz w:val="18"/>
+              </w:rPr>
+              <w:t>本项目（BlackBox）</w:t>
+            </w:r>
+          </w:p>
+        </w:tc>
+      </w:tr>
+      <w:tr>
+        <w:tc>
+          <w:tcPr>
+            <w:tcW w:type="dxa" w:w="4762"/>
+            <w:tcBorders>
+              <w:top w:val="single" w:sz="6" w:space="0" w:color="BFBFBF"/>
+              <w:left w:val="single" w:sz="6" w:space="0" w:color="BFBFBF"/>
+              <w:bottom w:val="single" w:sz="6" w:space="0" w:color="BFBFBF"/>
+              <w:right w:val="single" w:sz="6" w:space="0" w:color="BFBFBF"/>
+            </w:tcBorders>
+          </w:tcPr>
+          <w:p>
+            <w:pPr>
+              <w:jc w:val="center"/>
+            </w:pPr>
+            <w:r>
+              <w:drawing>
+                <wp:inline xmlns:a="http://schemas.openxmlformats.org/drawingml/2006/main" xmlns:pic="http://schemas.openxmlformats.org/drawingml/2006/picture">
+                  <wp:extent cx="1584556" cy="3420000"/>
+                  <wp:docPr id="11" name="Picture 11"/>
+                  <wp:cNvGraphicFramePr>
+                    <a:graphicFrameLocks noChangeAspect="1"/>
+                  </wp:cNvGraphicFramePr>
+                  <a:graphic>
+                    <a:graphicData uri="http://schemas.openxmlformats.org/drawingml/2006/picture">
+                      <pic:pic>
+                        <pic:nvPicPr>
+                          <pic:cNvPr id="0" name="10_OCR文本可编辑_01m35s.jpg"/>
+                          <pic:cNvPicPr/>
+                        </pic:nvPicPr>
+                        <pic:blipFill>
+                          <a:blip r:embed="rId19"/>
+                          <a:stretch>
+                            <a:fillRect/>
+                          </a:stretch>
+                        </pic:blipFill>
+                        <pic:spPr>
+                          <a:xfrm>
+                            <a:off x="0" y="0"/>
+                            <a:ext cx="1584556" cy="3420000"/>
+                          </a:xfrm>
+                          <a:prstGeom prst="rect"/>
+                        </pic:spPr>
+                      </pic:pic>
+                    </a:graphicData>
+                  </a:graphic>
+                </wp:inline>
+              </w:drawing>
+            </w:r>
+          </w:p>
+        </w:tc>
+        <w:tc>
+          <w:tcPr>
+            <w:tcW w:type="dxa" w:w="4762"/>
+            <w:tcBorders>
+              <w:top w:val="single" w:sz="6" w:space="0" w:color="BFBFBF"/>
+              <w:left w:val="single" w:sz="6" w:space="0" w:color="BFBFBF"/>
+              <w:bottom w:val="single" w:sz="6" w:space="0" w:color="BFBFBF"/>
+              <w:right w:val="single" w:sz="6" w:space="0" w:color="BFBFBF"/>
+            </w:tcBorders>
+          </w:tcPr>
+          <w:p>
+            <w:pPr>
+              <w:jc w:val="center"/>
+            </w:pPr>
+            <w:r>
+              <w:drawing>
+                <wp:inline xmlns:a="http://schemas.openxmlformats.org/drawingml/2006/main" xmlns:pic="http://schemas.openxmlformats.org/drawingml/2006/picture">
+                  <wp:extent cx="1573044" cy="3420000"/>
+                  <wp:docPr id="12" name="Picture 12"/>
+                  <wp:cNvGraphicFramePr>
+                    <a:graphicFrameLocks noChangeAspect="1"/>
+                  </wp:cNvGraphicFramePr>
+                  <a:graphic>
+                    <a:graphicData uri="http://schemas.openxmlformats.org/drawingml/2006/picture">
+                      <pic:pic>
+                        <pic:nvPicPr>
+                          <pic:cNvPr id="0" name="04_T07_ocr.png"/>
+                          <pic:cNvPicPr/>
+                        </pic:nvPicPr>
+                        <pic:blipFill>
+                          <a:blip r:embed="rId20"/>
+                          <a:stretch>
+                            <a:fillRect/>
+                          </a:stretch>
+                        </pic:blipFill>
+                        <pic:spPr>
+                          <a:xfrm>
+                            <a:off x="0" y="0"/>
+                            <a:ext cx="1573044" cy="3420000"/>
+                          </a:xfrm>
+                          <a:prstGeom prst="rect"/>
+                        </pic:spPr>
+                      </pic:pic>
+                    </a:graphicData>
+                  </a:graphic>
+                </wp:inline>
+              </w:drawing>
+            </w:r>
+          </w:p>
+        </w:tc>
+      </w:tr>
+      <w:tr>
+        <w:tc>
+          <w:tcPr>
+            <w:tcW w:type="dxa" w:w="4762"/>
+            <w:tcBorders>
+              <w:top w:val="single" w:sz="6" w:space="0" w:color="BFBFBF"/>
+              <w:left w:val="single" w:sz="6" w:space="0" w:color="BFBFBF"/>
+              <w:bottom w:val="single" w:sz="6" w:space="0" w:color="BFBFBF"/>
+              <w:right w:val="single" w:sz="6" w:space="0" w:color="BFBFBF"/>
+            </w:tcBorders>
+          </w:tcPr>
+          <w:p>
+            <w:pPr>
+              <w:jc w:val="center"/>
+            </w:pPr>
+            <w:r>
+              <w:rPr>
+                <w:color w:val="595959"/>
+                <w:sz w:val="18"/>
+              </w:rPr>
+              <w:t>参考版：CamScanner 录屏帧（一手证据）</w:t>
+            </w:r>
+          </w:p>
+        </w:tc>
+        <w:tc>
+          <w:tcPr>
+            <w:tcW w:type="dxa" w:w="4762"/>
+            <w:tcBorders>
+              <w:top w:val="single" w:sz="6" w:space="0" w:color="BFBFBF"/>
+              <w:left w:val="single" w:sz="6" w:space="0" w:color="BFBFBF"/>
+              <w:bottom w:val="single" w:sz="6" w:space="0" w:color="BFBFBF"/>
+              <w:right w:val="single" w:sz="6" w:space="0" w:color="BFBFBF"/>
+            </w:tcBorders>
+          </w:tcPr>
+          <w:p>
+            <w:pPr>
+              <w:jc w:val="center"/>
+            </w:pPr>
+            <w:r>
+              <w:rPr>
+                <w:color w:val="595959"/>
+                <w:sz w:val="18"/>
+              </w:rPr>
+              <w:t>本项目：04_T07_ocr.png</w:t>
+            </w:r>
+          </w:p>
+        </w:tc>
+      </w:tr>
+    </w:tbl>
+    <w:p/>
+    <w:p>
+      <w:pPr>
+        <w:pStyle w:val="Heading2"/>
+      </w:pPr>
+      <w:r>
+        <w:t>8.5  编辑</w:t>
+      </w:r>
+    </w:p>
+    <w:p>
+      <w:r>
+        <w:rPr>
+          <w:sz w:val="20"/>
+        </w:rPr>
+        <w:t>公开图只覆盖 CamCard 的「更换样式」（配色 / 社交链接）。本项目的「编辑名片」复用字段校正页（基本信息 / 联系方式 / 备注），保存后标记 .manual。字段表单形态仅能按第 7 节手册文字对照。</w:t>
+      </w:r>
+    </w:p>
+    <w:tbl>
+      <w:tblPr>
+        <w:tblW w:type="auto" w:w="0"/>
+        <w:jc w:val="center"/>
+        <w:tblLook w:firstColumn="1" w:firstRow="1" w:lastColumn="0" w:lastRow="0" w:noHBand="0" w:noVBand="1" w:val="04A0"/>
+        <w:tblLayout w:type="fixed"/>
+        <w:tblW w:w="9525" w:type="dxa"/>
+      </w:tblPr>
+      <w:tblGrid>
+        <w:gridCol w:w="4819"/>
+        <w:gridCol w:w="4819"/>
+      </w:tblGrid>
+      <w:tr>
+        <w:tc>
+          <w:tcPr>
+            <w:tcW w:type="dxa" w:w="4762"/>
+            <w:shd w:val="clear" w:fill="F2F2F2"/>
+            <w:tcBorders>
+              <w:top w:val="single" w:sz="6" w:space="0" w:color="BFBFBF"/>
+              <w:left w:val="single" w:sz="6" w:space="0" w:color="BFBFBF"/>
+              <w:bottom w:val="single" w:sz="6" w:space="0" w:color="BFBFBF"/>
+              <w:right w:val="single" w:sz="6" w:space="0" w:color="BFBFBF"/>
+            </w:tcBorders>
+          </w:tcPr>
+          <w:p>
+            <w:pPr>
+              <w:jc w:val="center"/>
+            </w:pPr>
+            <w:r/>
+            <w:r>
+              <w:rPr>
+                <w:b/>
+                <w:sz w:val="18"/>
+              </w:rPr>
+              <w:t>参考版（CamCard 公开素材）</w:t>
+            </w:r>
+          </w:p>
+        </w:tc>
+        <w:tc>
+          <w:tcPr>
+            <w:tcW w:type="dxa" w:w="4762"/>
+            <w:shd w:val="clear" w:fill="F2F2F2"/>
+            <w:tcBorders>
+              <w:top w:val="single" w:sz="6" w:space="0" w:color="BFBFBF"/>
+              <w:left w:val="single" w:sz="6" w:space="0" w:color="BFBFBF"/>
+              <w:bottom w:val="single" w:sz="6" w:space="0" w:color="BFBFBF"/>
+              <w:right w:val="single" w:sz="6" w:space="0" w:color="BFBFBF"/>
+            </w:tcBorders>
+          </w:tcPr>
+          <w:p>
+            <w:pPr>
+              <w:jc w:val="center"/>
+            </w:pPr>
+            <w:r/>
+            <w:r>
+              <w:rPr>
+                <w:b/>
+                <w:sz w:val="18"/>
+              </w:rPr>
+              <w:t>本项目（BlackBox）</w:t>
+            </w:r>
+          </w:p>
+        </w:tc>
+      </w:tr>
+      <w:tr>
+        <w:tc>
+          <w:tcPr>
+            <w:tcW w:type="dxa" w:w="4762"/>
+            <w:tcBorders>
+              <w:top w:val="single" w:sz="6" w:space="0" w:color="BFBFBF"/>
+              <w:left w:val="single" w:sz="6" w:space="0" w:color="BFBFBF"/>
+              <w:bottom w:val="single" w:sz="6" w:space="0" w:color="BFBFBF"/>
+              <w:right w:val="single" w:sz="6" w:space="0" w:color="BFBFBF"/>
+            </w:tcBorders>
+          </w:tcPr>
+          <w:p>
+            <w:pPr>
+              <w:jc w:val="center"/>
+            </w:pPr>
+            <w:r>
+              <w:drawing>
+                <wp:inline xmlns:a="http://schemas.openxmlformats.org/drawingml/2006/main" xmlns:pic="http://schemas.openxmlformats.org/drawingml/2006/picture">
+                  <wp:extent cx="1925288" cy="3420000"/>
+                  <wp:docPr id="13" name="Picture 13"/>
+                  <wp:cNvGraphicFramePr>
+                    <a:graphicFrameLocks noChangeAspect="1"/>
+                  </wp:cNvGraphicFramePr>
+                  <a:graphic>
+                    <a:graphicData uri="http://schemas.openxmlformats.org/drawingml/2006/picture">
+                      <pic:pic>
+                        <pic:nvPicPr>
+                          <pic:cNvPr id="0" name="camcard_store_edit.png"/>
+                          <pic:cNvPicPr/>
+                        </pic:nvPicPr>
+                        <pic:blipFill>
+                          <a:blip r:embed="rId21"/>
+                          <a:stretch>
+                            <a:fillRect/>
+                          </a:stretch>
+                        </pic:blipFill>
+                        <pic:spPr>
+                          <a:xfrm>
+                            <a:off x="0" y="0"/>
+                            <a:ext cx="1925288" cy="3420000"/>
+                          </a:xfrm>
+                          <a:prstGeom prst="rect"/>
+                        </pic:spPr>
+                      </pic:pic>
+                    </a:graphicData>
+                  </a:graphic>
+                </wp:inline>
+              </w:drawing>
+            </w:r>
+          </w:p>
+        </w:tc>
+        <w:tc>
+          <w:tcPr>
+            <w:tcW w:type="dxa" w:w="4762"/>
+            <w:tcBorders>
+              <w:top w:val="single" w:sz="6" w:space="0" w:color="BFBFBF"/>
+              <w:left w:val="single" w:sz="6" w:space="0" w:color="BFBFBF"/>
+              <w:bottom w:val="single" w:sz="6" w:space="0" w:color="BFBFBF"/>
+              <w:right w:val="single" w:sz="6" w:space="0" w:color="BFBFBF"/>
+            </w:tcBorders>
+          </w:tcPr>
+          <w:p>
+            <w:pPr>
+              <w:jc w:val="center"/>
+            </w:pPr>
+            <w:r>
+              <w:drawing>
+                <wp:inline xmlns:a="http://schemas.openxmlformats.org/drawingml/2006/main" xmlns:pic="http://schemas.openxmlformats.org/drawingml/2006/picture">
+                  <wp:extent cx="1573044" cy="3420000"/>
+                  <wp:docPr id="14" name="Picture 14"/>
+                  <wp:cNvGraphicFramePr>
+                    <a:graphicFrameLocks noChangeAspect="1"/>
+                  </wp:cNvGraphicFramePr>
+                  <a:graphic>
+                    <a:graphicData uri="http://schemas.openxmlformats.org/drawingml/2006/picture">
+                      <pic:pic>
+                        <pic:nvPicPr>
+                          <pic:cNvPr id="0" name="10_T14_edit.png"/>
+                          <pic:cNvPicPr/>
+                        </pic:nvPicPr>
+                        <pic:blipFill>
+                          <a:blip r:embed="rId22"/>
+                          <a:stretch>
+                            <a:fillRect/>
+                          </a:stretch>
+                        </pic:blipFill>
+                        <pic:spPr>
+                          <a:xfrm>
+                            <a:off x="0" y="0"/>
+                            <a:ext cx="1573044" cy="3420000"/>
+                          </a:xfrm>
+                          <a:prstGeom prst="rect"/>
+                        </pic:spPr>
+                      </pic:pic>
+                    </a:graphicData>
+                  </a:graphic>
+                </wp:inline>
+              </w:drawing>
+            </w:r>
+          </w:p>
+        </w:tc>
+      </w:tr>
+      <w:tr>
+        <w:tc>
+          <w:tcPr>
+            <w:tcW w:type="dxa" w:w="4762"/>
+            <w:tcBorders>
+              <w:top w:val="single" w:sz="6" w:space="0" w:color="BFBFBF"/>
+              <w:left w:val="single" w:sz="6" w:space="0" w:color="BFBFBF"/>
+              <w:bottom w:val="single" w:sz="6" w:space="0" w:color="BFBFBF"/>
+              <w:right w:val="single" w:sz="6" w:space="0" w:color="BFBFBF"/>
+            </w:tcBorders>
+          </w:tcPr>
+          <w:p>
+            <w:pPr>
+              <w:jc w:val="center"/>
+            </w:pPr>
+            <w:r>
+              <w:rPr>
+                <w:color w:val="595959"/>
+                <w:sz w:val="18"/>
+              </w:rPr>
+              <w:t>参考版：样式编辑（App Store 美区）</w:t>
+            </w:r>
+          </w:p>
+        </w:tc>
+        <w:tc>
+          <w:tcPr>
+            <w:tcW w:type="dxa" w:w="4762"/>
+            <w:tcBorders>
+              <w:top w:val="single" w:sz="6" w:space="0" w:color="BFBFBF"/>
+              <w:left w:val="single" w:sz="6" w:space="0" w:color="BFBFBF"/>
+              <w:bottom w:val="single" w:sz="6" w:space="0" w:color="BFBFBF"/>
+              <w:right w:val="single" w:sz="6" w:space="0" w:color="BFBFBF"/>
+            </w:tcBorders>
+          </w:tcPr>
+          <w:p>
+            <w:pPr>
+              <w:jc w:val="center"/>
+            </w:pPr>
+            <w:r>
+              <w:rPr>
+                <w:color w:val="595959"/>
+                <w:sz w:val="18"/>
+              </w:rPr>
+              <w:t>本项目：10_T14_edit.png</w:t>
+            </w:r>
+          </w:p>
+        </w:tc>
+      </w:tr>
+    </w:tbl>
+    <w:p/>
+    <w:p>
+      <w:pPr>
+        <w:pStyle w:val="Heading2"/>
+      </w:pPr>
+      <w:r>
+        <w:t>8.6  覆盖情况小结</w:t>
+      </w:r>
+    </w:p>
+    <w:tbl>
+      <w:tblPr>
+        <w:tblW w:type="auto" w:w="0"/>
+        <w:tblLook w:firstColumn="1" w:firstRow="1" w:lastColumn="0" w:lastRow="0" w:noHBand="0" w:noVBand="1" w:val="04A0"/>
+        <w:tblLayout w:type="fixed"/>
+        <w:tblW w:w="9525" w:type="dxa"/>
+      </w:tblPr>
+      <w:tblGrid>
+        <w:gridCol w:w="2409"/>
+        <w:gridCol w:w="2409"/>
+        <w:gridCol w:w="2409"/>
+        <w:gridCol w:w="2409"/>
+      </w:tblGrid>
+      <w:tr>
+        <w:tc>
+          <w:tcPr>
+            <w:tcW w:type="dxa" w:w="2041"/>
+            <w:shd w:val="clear" w:fill="F2F2F2"/>
+            <w:tcBorders>
+              <w:top w:val="single" w:sz="6" w:space="0" w:color="BFBFBF"/>
+              <w:left w:val="single" w:sz="6" w:space="0" w:color="BFBFBF"/>
+              <w:bottom w:val="single" w:sz="6" w:space="0" w:color="BFBFBF"/>
+              <w:right w:val="single" w:sz="6" w:space="0" w:color="BFBFBF"/>
+            </w:tcBorders>
+          </w:tcPr>
+          <w:p>
+            <w:r/>
+            <w:r>
+              <w:rPr>
+                <w:b/>
+                <w:sz w:val="18"/>
+              </w:rPr>
+              <w:t>页面</w:t>
+            </w:r>
+          </w:p>
+        </w:tc>
+        <w:tc>
+          <w:tcPr>
+            <w:tcW w:type="dxa" w:w="2494"/>
+            <w:shd w:val="clear" w:fill="F2F2F2"/>
+            <w:tcBorders>
+              <w:top w:val="single" w:sz="6" w:space="0" w:color="BFBFBF"/>
+              <w:left w:val="single" w:sz="6" w:space="0" w:color="BFBFBF"/>
+              <w:bottom w:val="single" w:sz="6" w:space="0" w:color="BFBFBF"/>
+              <w:right w:val="single" w:sz="6" w:space="0" w:color="BFBFBF"/>
+            </w:tcBorders>
+          </w:tcPr>
+          <w:p>
+            <w:r/>
+            <w:r>
+              <w:rPr>
+                <w:b/>
+                <w:sz w:val="18"/>
+              </w:rPr>
+              <w:t>参考素材</w:t>
+            </w:r>
+          </w:p>
+        </w:tc>
+        <w:tc>
+          <w:tcPr>
+            <w:tcW w:type="dxa" w:w="1474"/>
+            <w:shd w:val="clear" w:fill="F2F2F2"/>
+            <w:tcBorders>
+              <w:top w:val="single" w:sz="6" w:space="0" w:color="BFBFBF"/>
+              <w:left w:val="single" w:sz="6" w:space="0" w:color="BFBFBF"/>
+              <w:bottom w:val="single" w:sz="6" w:space="0" w:color="BFBFBF"/>
+              <w:right w:val="single" w:sz="6" w:space="0" w:color="BFBFBF"/>
+            </w:tcBorders>
+          </w:tcPr>
+          <w:p>
+            <w:r/>
+            <w:r>
+              <w:rPr>
+                <w:b/>
+                <w:sz w:val="18"/>
+              </w:rPr>
+              <w:t>是否有图</w:t>
+            </w:r>
+          </w:p>
+        </w:tc>
+        <w:tc>
+          <w:tcPr>
+            <w:tcW w:type="dxa" w:w="3515"/>
+            <w:shd w:val="clear" w:fill="F2F2F2"/>
+            <w:tcBorders>
+              <w:top w:val="single" w:sz="6" w:space="0" w:color="BFBFBF"/>
+              <w:left w:val="single" w:sz="6" w:space="0" w:color="BFBFBF"/>
+              <w:bottom w:val="single" w:sz="6" w:space="0" w:color="BFBFBF"/>
+              <w:right w:val="single" w:sz="6" w:space="0" w:color="BFBFBF"/>
+            </w:tcBorders>
+          </w:tcPr>
+          <w:p>
+            <w:r/>
+            <w:r>
+              <w:rPr>
+                <w:b/>
+                <w:sz w:val="18"/>
+              </w:rPr>
+              <w:t>结论</w:t>
+            </w:r>
+          </w:p>
+        </w:tc>
+      </w:tr>
+      <w:tr>
+        <w:tc>
+          <w:tcPr>
+            <w:tcW w:type="dxa" w:w="2041"/>
+            <w:tcBorders>
+              <w:top w:val="single" w:sz="6" w:space="0" w:color="BFBFBF"/>
+              <w:left w:val="single" w:sz="6" w:space="0" w:color="BFBFBF"/>
+              <w:bottom w:val="single" w:sz="6" w:space="0" w:color="BFBFBF"/>
+              <w:right w:val="single" w:sz="6" w:space="0" w:color="BFBFBF"/>
+            </w:tcBorders>
+          </w:tcPr>
+          <w:p>
+            <w:r/>
+            <w:r>
+              <w:rPr>
+                <w:sz w:val="18"/>
+              </w:rPr>
+              <w:t>边界检测 / 校正</w:t>
+            </w:r>
+          </w:p>
+        </w:tc>
+        <w:tc>
+          <w:tcPr>
+            <w:tcW w:type="dxa" w:w="2494"/>
+            <w:tcBorders>
+              <w:top w:val="single" w:sz="6" w:space="0" w:color="BFBFBF"/>
+              <w:left w:val="single" w:sz="6" w:space="0" w:color="BFBFBF"/>
+              <w:bottom w:val="single" w:sz="6" w:space="0" w:color="BFBFBF"/>
+              <w:right w:val="single" w:sz="6" w:space="0" w:color="BFBFBF"/>
+            </w:tcBorders>
+          </w:tcPr>
+          <w:p>
+            <w:r/>
+            <w:r>
+              <w:rPr>
+                <w:sz w:val="18"/>
+              </w:rPr>
+              <w:t>App Store 美区拍摄页</w:t>
+            </w:r>
+          </w:p>
+        </w:tc>
+        <w:tc>
+          <w:tcPr>
+            <w:tcW w:type="dxa" w:w="1474"/>
+            <w:tcBorders>
+              <w:top w:val="single" w:sz="6" w:space="0" w:color="BFBFBF"/>
+              <w:left w:val="single" w:sz="6" w:space="0" w:color="BFBFBF"/>
+              <w:bottom w:val="single" w:sz="6" w:space="0" w:color="BFBFBF"/>
+              <w:right w:val="single" w:sz="6" w:space="0" w:color="BFBFBF"/>
+            </w:tcBorders>
+          </w:tcPr>
+          <w:p>
+            <w:r/>
+            <w:r>
+              <w:rPr>
+                <w:sz w:val="18"/>
+              </w:rPr>
+              <w:t>有</w:t>
+            </w:r>
+          </w:p>
+        </w:tc>
+        <w:tc>
+          <w:tcPr>
+            <w:tcW w:type="dxa" w:w="3515"/>
+            <w:tcBorders>
+              <w:top w:val="single" w:sz="6" w:space="0" w:color="BFBFBF"/>
+              <w:left w:val="single" w:sz="6" w:space="0" w:color="BFBFBF"/>
+              <w:bottom w:val="single" w:sz="6" w:space="0" w:color="BFBFBF"/>
+              <w:right w:val="single" w:sz="6" w:space="0" w:color="BFBFBF"/>
+            </w:tcBorders>
+          </w:tcPr>
+          <w:p>
+            <w:r/>
+            <w:r>
+              <w:rPr>
+                <w:sz w:val="18"/>
+              </w:rPr>
+              <w:t>可对比；参考为拍摄中实时框选，本项目为拍后检测 + 手调</w:t>
+            </w:r>
+          </w:p>
+        </w:tc>
+      </w:tr>
+      <w:tr>
+        <w:tc>
+          <w:tcPr>
+            <w:tcW w:type="dxa" w:w="2041"/>
+            <w:tcBorders>
+              <w:top w:val="single" w:sz="6" w:space="0" w:color="BFBFBF"/>
+              <w:left w:val="single" w:sz="6" w:space="0" w:color="BFBFBF"/>
+              <w:bottom w:val="single" w:sz="6" w:space="0" w:color="BFBFBF"/>
+              <w:right w:val="single" w:sz="6" w:space="0" w:color="BFBFBF"/>
+            </w:tcBorders>
+          </w:tcPr>
+          <w:p>
+            <w:r/>
+            <w:r>
+              <w:rPr>
+                <w:sz w:val="18"/>
+              </w:rPr>
+              <w:t>名片详情</w:t>
+            </w:r>
+          </w:p>
+        </w:tc>
+        <w:tc>
+          <w:tcPr>
+            <w:tcW w:type="dxa" w:w="2494"/>
+            <w:tcBorders>
+              <w:top w:val="single" w:sz="6" w:space="0" w:color="BFBFBF"/>
+              <w:left w:val="single" w:sz="6" w:space="0" w:color="BFBFBF"/>
+              <w:bottom w:val="single" w:sz="6" w:space="0" w:color="BFBFBF"/>
+              <w:right w:val="single" w:sz="6" w:space="0" w:color="BFBFBF"/>
+            </w:tcBorders>
+          </w:tcPr>
+          <w:p>
+            <w:r/>
+            <w:r>
+              <w:rPr>
+                <w:sz w:val="18"/>
+              </w:rPr>
+              <w:t>官网产品页数字名片详情</w:t>
+            </w:r>
+          </w:p>
+        </w:tc>
+        <w:tc>
+          <w:tcPr>
+            <w:tcW w:type="dxa" w:w="1474"/>
+            <w:tcBorders>
+              <w:top w:val="single" w:sz="6" w:space="0" w:color="BFBFBF"/>
+              <w:left w:val="single" w:sz="6" w:space="0" w:color="BFBFBF"/>
+              <w:bottom w:val="single" w:sz="6" w:space="0" w:color="BFBFBF"/>
+              <w:right w:val="single" w:sz="6" w:space="0" w:color="BFBFBF"/>
+            </w:tcBorders>
+          </w:tcPr>
+          <w:p>
+            <w:r/>
+            <w:r>
+              <w:rPr>
+                <w:sz w:val="18"/>
+              </w:rPr>
+              <w:t>有</w:t>
+            </w:r>
+          </w:p>
+        </w:tc>
+        <w:tc>
+          <w:tcPr>
+            <w:tcW w:type="dxa" w:w="3515"/>
+            <w:tcBorders>
+              <w:top w:val="single" w:sz="6" w:space="0" w:color="BFBFBF"/>
+              <w:left w:val="single" w:sz="6" w:space="0" w:color="BFBFBF"/>
+              <w:bottom w:val="single" w:sz="6" w:space="0" w:color="BFBFBF"/>
+              <w:right w:val="single" w:sz="6" w:space="0" w:color="BFBFBF"/>
+            </w:tcBorders>
+          </w:tcPr>
+          <w:p>
+            <w:r/>
+            <w:r>
+              <w:rPr>
+                <w:sz w:val="18"/>
+              </w:rPr>
+              <w:t>可对比；参考为数字名片，扫描名片详情无公开图</w:t>
+            </w:r>
+          </w:p>
+        </w:tc>
+      </w:tr>
+      <w:tr>
+        <w:tc>
+          <w:tcPr>
+            <w:tcW w:type="dxa" w:w="2041"/>
+            <w:tcBorders>
+              <w:top w:val="single" w:sz="6" w:space="0" w:color="BFBFBF"/>
+              <w:left w:val="single" w:sz="6" w:space="0" w:color="BFBFBF"/>
+              <w:bottom w:val="single" w:sz="6" w:space="0" w:color="BFBFBF"/>
+              <w:right w:val="single" w:sz="6" w:space="0" w:color="BFBFBF"/>
+            </w:tcBorders>
+          </w:tcPr>
+          <w:p>
+            <w:r/>
+            <w:r>
+              <w:rPr>
+                <w:sz w:val="18"/>
+              </w:rPr>
+              <w:t>搜索</w:t>
+            </w:r>
+          </w:p>
+        </w:tc>
+        <w:tc>
+          <w:tcPr>
+            <w:tcW w:type="dxa" w:w="2494"/>
+            <w:tcBorders>
+              <w:top w:val="single" w:sz="6" w:space="0" w:color="BFBFBF"/>
+              <w:left w:val="single" w:sz="6" w:space="0" w:color="BFBFBF"/>
+              <w:bottom w:val="single" w:sz="6" w:space="0" w:color="BFBFBF"/>
+              <w:right w:val="single" w:sz="6" w:space="0" w:color="BFBFBF"/>
+            </w:tcBorders>
+          </w:tcPr>
+          <w:p>
+            <w:r/>
+            <w:r>
+              <w:rPr>
+                <w:sz w:val="18"/>
+              </w:rPr>
+              <w:t>App Store 中国区人脉搜索</w:t>
+            </w:r>
+          </w:p>
+        </w:tc>
+        <w:tc>
+          <w:tcPr>
+            <w:tcW w:type="dxa" w:w="1474"/>
+            <w:tcBorders>
+              <w:top w:val="single" w:sz="6" w:space="0" w:color="BFBFBF"/>
+              <w:left w:val="single" w:sz="6" w:space="0" w:color="BFBFBF"/>
+              <w:bottom w:val="single" w:sz="6" w:space="0" w:color="BFBFBF"/>
+              <w:right w:val="single" w:sz="6" w:space="0" w:color="BFBFBF"/>
+            </w:tcBorders>
+          </w:tcPr>
+          <w:p>
+            <w:r/>
+            <w:r>
+              <w:rPr>
+                <w:sz w:val="18"/>
+              </w:rPr>
+              <w:t>有</w:t>
+            </w:r>
+          </w:p>
+        </w:tc>
+        <w:tc>
+          <w:tcPr>
+            <w:tcW w:type="dxa" w:w="3515"/>
+            <w:tcBorders>
+              <w:top w:val="single" w:sz="6" w:space="0" w:color="BFBFBF"/>
+              <w:left w:val="single" w:sz="6" w:space="0" w:color="BFBFBF"/>
+              <w:bottom w:val="single" w:sz="6" w:space="0" w:color="BFBFBF"/>
+              <w:right w:val="single" w:sz="6" w:space="0" w:color="BFBFBF"/>
+            </w:tcBorders>
+          </w:tcPr>
+          <w:p>
+            <w:r/>
+            <w:r>
+              <w:rPr>
+                <w:sz w:val="18"/>
+              </w:rPr>
+              <w:t>可对比；参考为企业人脉搜索，本项目为本地名片搜索</w:t>
+            </w:r>
+          </w:p>
+        </w:tc>
+      </w:tr>
+      <w:tr>
+        <w:tc>
+          <w:tcPr>
+            <w:tcW w:type="dxa" w:w="2041"/>
+            <w:tcBorders>
+              <w:top w:val="single" w:sz="6" w:space="0" w:color="BFBFBF"/>
+              <w:left w:val="single" w:sz="6" w:space="0" w:color="BFBFBF"/>
+              <w:bottom w:val="single" w:sz="6" w:space="0" w:color="BFBFBF"/>
+              <w:right w:val="single" w:sz="6" w:space="0" w:color="BFBFBF"/>
+            </w:tcBorders>
+          </w:tcPr>
+          <w:p>
+            <w:r/>
+            <w:r>
+              <w:rPr>
+                <w:sz w:val="18"/>
+              </w:rPr>
+              <w:t>识别结果（OCR）</w:t>
+            </w:r>
+          </w:p>
+        </w:tc>
+        <w:tc>
+          <w:tcPr>
+            <w:tcW w:type="dxa" w:w="2494"/>
+            <w:tcBorders>
+              <w:top w:val="single" w:sz="6" w:space="0" w:color="BFBFBF"/>
+              <w:left w:val="single" w:sz="6" w:space="0" w:color="BFBFBF"/>
+              <w:bottom w:val="single" w:sz="6" w:space="0" w:color="BFBFBF"/>
+              <w:right w:val="single" w:sz="6" w:space="0" w:color="BFBFBF"/>
+            </w:tcBorders>
+          </w:tcPr>
+          <w:p>
+            <w:r/>
+            <w:r>
+              <w:rPr>
+                <w:sz w:val="18"/>
+              </w:rPr>
+              <w:t>CamScanner 录屏帧</w:t>
+            </w:r>
+          </w:p>
+        </w:tc>
+        <w:tc>
+          <w:tcPr>
+            <w:tcW w:type="dxa" w:w="1474"/>
+            <w:tcBorders>
+              <w:top w:val="single" w:sz="6" w:space="0" w:color="BFBFBF"/>
+              <w:left w:val="single" w:sz="6" w:space="0" w:color="BFBFBF"/>
+              <w:bottom w:val="single" w:sz="6" w:space="0" w:color="BFBFBF"/>
+              <w:right w:val="single" w:sz="6" w:space="0" w:color="BFBFBF"/>
+            </w:tcBorders>
+          </w:tcPr>
+          <w:p>
+            <w:r/>
+            <w:r>
+              <w:rPr>
+                <w:sz w:val="18"/>
+              </w:rPr>
+              <w:t>有（非 CamCard）</w:t>
+            </w:r>
+          </w:p>
+        </w:tc>
+        <w:tc>
+          <w:tcPr>
+            <w:tcW w:type="dxa" w:w="3515"/>
+            <w:tcBorders>
+              <w:top w:val="single" w:sz="6" w:space="0" w:color="BFBFBF"/>
+              <w:left w:val="single" w:sz="6" w:space="0" w:color="BFBFBF"/>
+              <w:bottom w:val="single" w:sz="6" w:space="0" w:color="BFBFBF"/>
+              <w:right w:val="single" w:sz="6" w:space="0" w:color="BFBFBF"/>
+            </w:tcBorders>
+          </w:tcPr>
+          <w:p>
+            <w:r/>
+            <w:r>
+              <w:rPr>
+                <w:sz w:val="18"/>
+              </w:rPr>
+              <w:t>CamCard 无公开图，使用一手录屏帧替代</w:t>
+            </w:r>
+          </w:p>
+        </w:tc>
+      </w:tr>
+      <w:tr>
+        <w:tc>
+          <w:tcPr>
+            <w:tcW w:type="dxa" w:w="2041"/>
+            <w:tcBorders>
+              <w:top w:val="single" w:sz="6" w:space="0" w:color="BFBFBF"/>
+              <w:left w:val="single" w:sz="6" w:space="0" w:color="BFBFBF"/>
+              <w:bottom w:val="single" w:sz="6" w:space="0" w:color="BFBFBF"/>
+              <w:right w:val="single" w:sz="6" w:space="0" w:color="BFBFBF"/>
+            </w:tcBorders>
+          </w:tcPr>
+          <w:p>
+            <w:r/>
+            <w:r>
+              <w:rPr>
+                <w:sz w:val="18"/>
+              </w:rPr>
+              <w:t>编辑</w:t>
+            </w:r>
+          </w:p>
+        </w:tc>
+        <w:tc>
+          <w:tcPr>
+            <w:tcW w:type="dxa" w:w="2494"/>
+            <w:tcBorders>
+              <w:top w:val="single" w:sz="6" w:space="0" w:color="BFBFBF"/>
+              <w:left w:val="single" w:sz="6" w:space="0" w:color="BFBFBF"/>
+              <w:bottom w:val="single" w:sz="6" w:space="0" w:color="BFBFBF"/>
+              <w:right w:val="single" w:sz="6" w:space="0" w:color="BFBFBF"/>
+            </w:tcBorders>
+          </w:tcPr>
+          <w:p>
+            <w:r/>
+            <w:r>
+              <w:rPr>
+                <w:sz w:val="18"/>
+              </w:rPr>
+              <w:t>App Store 美区样式编辑</w:t>
+            </w:r>
+          </w:p>
+        </w:tc>
+        <w:tc>
+          <w:tcPr>
+            <w:tcW w:type="dxa" w:w="1474"/>
+            <w:tcBorders>
+              <w:top w:val="single" w:sz="6" w:space="0" w:color="BFBFBF"/>
+              <w:left w:val="single" w:sz="6" w:space="0" w:color="BFBFBF"/>
+              <w:bottom w:val="single" w:sz="6" w:space="0" w:color="BFBFBF"/>
+              <w:right w:val="single" w:sz="6" w:space="0" w:color="BFBFBF"/>
+            </w:tcBorders>
+          </w:tcPr>
+          <w:p>
+            <w:r/>
+            <w:r>
+              <w:rPr>
+                <w:sz w:val="18"/>
+              </w:rPr>
+              <w:t>有（仅样式）</w:t>
+            </w:r>
+          </w:p>
+        </w:tc>
+        <w:tc>
+          <w:tcPr>
+            <w:tcW w:type="dxa" w:w="3515"/>
+            <w:tcBorders>
+              <w:top w:val="single" w:sz="6" w:space="0" w:color="BFBFBF"/>
+              <w:left w:val="single" w:sz="6" w:space="0" w:color="BFBFBF"/>
+              <w:bottom w:val="single" w:sz="6" w:space="0" w:color="BFBFBF"/>
+              <w:right w:val="single" w:sz="6" w:space="0" w:color="BFBFBF"/>
+            </w:tcBorders>
+          </w:tcPr>
+          <w:p>
+            <w:r/>
+            <w:r>
+              <w:rPr>
+                <w:sz w:val="18"/>
+              </w:rPr>
+              <w:t>字段编辑表单无公开图，只能按手册文字对照</w:t>
+            </w:r>
+          </w:p>
+        </w:tc>
+      </w:tr>
+    </w:tbl>
+    <w:p>
+      <w:r>
+        <w:rPr>
+          <w:sz w:val="18"/>
+        </w:rPr>
+        <w:t>素材局限：参考图均含设备外框与营销文案，尺寸/状态栏与本项目截图不同，不能做像素级 diff；除 8.4 外均为 CamCard 公开素材，非教师锁定版本。</w:t>
+      </w:r>
+    </w:p>
     <w:sectPr>
       <w:pgSz w:w="11906" w:h="16838"/>
       <w:pgMar w:top="1134" w:right="1134" w:bottom="1134" w:left="1134" w:header="720" w:footer="720" w:gutter="0"/>

</xml_diff>